<commit_message>
Update product requirements document
</commit_message>
<xml_diff>
--- a/LOL峡谷智能搭子.docx
+++ b/LOL峡谷智能搭子.docx
@@ -122,15 +122,7 @@
         <w:t>BP</w:t>
       </w:r>
       <w:r>
-        <w:t>还是对局内，既要考虑自身水平和风格，又要兼顾收集队友和对手的信息，信息多</w:t>
-      </w:r>
-      <w:proofErr w:type="gramStart"/>
-      <w:r>
-        <w:t>且决策</w:t>
-      </w:r>
-      <w:proofErr w:type="gramEnd"/>
-      <w:r>
-        <w:t>时间短。</w:t>
+        <w:t>还是对局内，既要考虑自身水平和风格，又要兼顾收集队友和对手的信息，信息多且决策时间短。</w:t>
       </w:r>
     </w:p>
     <w:p>
@@ -196,31 +188,7 @@
         <w:t>识别信号：</w:t>
       </w:r>
       <w:r>
-        <w:t>账号等级低、峡谷对局数少、英雄池极浅。新英雄试玩频繁，但</w:t>
-      </w:r>
-      <w:proofErr w:type="gramStart"/>
-      <w:r>
-        <w:t>单英雄</w:t>
-      </w:r>
-      <w:proofErr w:type="gramEnd"/>
-      <w:r>
-        <w:t>连续使用率低。对局中装备购买、技能升级、回城节奏异常。</w:t>
-      </w:r>
-      <w:proofErr w:type="gramStart"/>
-      <w:r>
-        <w:t>低补刀</w:t>
-      </w:r>
-      <w:proofErr w:type="gramEnd"/>
-      <w:r>
-        <w:t>、低参团、</w:t>
-      </w:r>
-      <w:proofErr w:type="gramStart"/>
-      <w:r>
-        <w:t>低地图资源</w:t>
-      </w:r>
-      <w:proofErr w:type="gramEnd"/>
-      <w:r>
-        <w:t>参与，死亡次数高。搜索行为集中在</w:t>
+        <w:t>账号等级低、峡谷对局数少、英雄池极浅。新英雄试玩频繁，但单英雄连续使用率低。对局中装备购买、技能升级、回城节奏异常。低补刀、低参团、低地图资源参与，死亡次数高。搜索行为集中在</w:t>
       </w:r>
       <w:r>
         <w:t>“</w:t>
@@ -255,29 +223,13 @@
         <w:t>典型表现：</w:t>
       </w:r>
       <w:r>
-        <w:t>不理解五个位置的职责和基本分工。不</w:t>
-      </w:r>
-      <w:proofErr w:type="gramStart"/>
-      <w:r>
-        <w:t>清楚兵线</w:t>
-      </w:r>
-      <w:proofErr w:type="gramEnd"/>
-      <w:r>
-        <w:t>、补刀、推塔、野怪、资源点之间的优先级。不理解技能描述、被动机制、冷却时间、蓝量</w:t>
+        <w:t>不理解五个位置的职责和基本分工。不清楚兵线、补刀、推塔、野怪、资源点之间的优先级。不理解技能描述、被动机制、冷却时间、蓝量</w:t>
       </w:r>
       <w:r>
         <w:t>/</w:t>
       </w:r>
       <w:r>
-        <w:t>能量、召唤师技能。不是根据自身的玩法风格选择英雄，而是常因外观、推荐或朋友建议选择英雄。容易出现无目的游走、死亡后直接上线、</w:t>
-      </w:r>
-      <w:proofErr w:type="gramStart"/>
-      <w:r>
-        <w:t>团战找不到</w:t>
-      </w:r>
-      <w:proofErr w:type="gramEnd"/>
-      <w:r>
-        <w:t>站位等问题。</w:t>
+        <w:t>能量、召唤师技能。不是根据自身的玩法风格选择英雄，而是常因外观、推荐或朋友建议选择英雄。容易出现无目的游走、死亡后直接上线、团战找不到站位等问题。</w:t>
       </w:r>
     </w:p>
     <w:p>
@@ -317,13 +269,8 @@
       <w:r>
         <w:t xml:space="preserve"> → </w:t>
       </w:r>
-      <w:proofErr w:type="gramStart"/>
-      <w:r>
-        <w:t>参与团战</w:t>
-      </w:r>
-      <w:proofErr w:type="gramEnd"/>
-      <w:r>
-        <w:t>。首选推荐操作简单、定位明确的英雄，并给出</w:t>
+      <w:r>
+        <w:t>参与团战。首选推荐操作简单、定位明确的英雄，并给出</w:t>
       </w:r>
       <w:r>
         <w:t>“</w:t>
@@ -370,15 +317,7 @@
         <w:t>识别方式：</w:t>
       </w:r>
       <w:r>
-        <w:t>其他模式场次明显高于峡谷场次。英雄熟练度较高，但峡谷战绩、补刀、经济转化或资源参与偏低。峡谷中频繁参团或游走，但经验、经济常落后于</w:t>
-      </w:r>
-      <w:proofErr w:type="gramStart"/>
-      <w:r>
-        <w:t>同位置</w:t>
-      </w:r>
-      <w:proofErr w:type="gramEnd"/>
-      <w:r>
-        <w:t>对手。偏好选择自己熟悉的英雄，却不考虑分路和阵容。对局行为呈现</w:t>
+        <w:t>其他模式场次明显高于峡谷场次。英雄熟练度较高，但峡谷战绩、补刀、经济转化或资源参与偏低。峡谷中频繁参团或游走，但经验、经济常落后于同位置对手。偏好选择自己熟悉的英雄，却不考虑分路和阵容。对局行为呈现</w:t>
       </w:r>
       <w:r>
         <w:t>“</w:t>
@@ -413,31 +352,7 @@
         <w:t>”</w:t>
       </w:r>
       <w:r>
-        <w:t>的认知：前期发育，中期资源交换，</w:t>
-      </w:r>
-      <w:proofErr w:type="gramStart"/>
-      <w:r>
-        <w:t>后期团战与兵线</w:t>
-      </w:r>
-      <w:proofErr w:type="gramEnd"/>
-      <w:r>
-        <w:t>运营。个人硬实力上，缺乏兵线、补刀、视野、</w:t>
-      </w:r>
-      <w:proofErr w:type="gramStart"/>
-      <w:r>
-        <w:t>打野路线</w:t>
-      </w:r>
-      <w:proofErr w:type="gramEnd"/>
-      <w:r>
-        <w:t>和资源刷新时间等基础能力。知道英雄连招和团战玩法，但不理解</w:t>
-      </w:r>
-      <w:proofErr w:type="gramStart"/>
-      <w:r>
-        <w:t>对线期应</w:t>
-      </w:r>
-      <w:proofErr w:type="gramEnd"/>
-      <w:r>
-        <w:t>做什么。偏好</w:t>
+        <w:t>的认知：前期发育，中期资源交换，后期团战与兵线运营。个人硬实力上，缺乏兵线、补刀、视野、打野路线和资源刷新时间等基础能力。知道英雄连招和团战玩法，但不理解对线期应做什么。偏好</w:t>
       </w:r>
       <w:r>
         <w:t>“</w:t>
@@ -449,39 +364,7 @@
         <w:t>”</w:t>
       </w:r>
       <w:r>
-        <w:t>，容易忽略补刀、经验、</w:t>
-      </w:r>
-      <w:proofErr w:type="gramStart"/>
-      <w:r>
-        <w:t>兵线和</w:t>
-      </w:r>
-      <w:proofErr w:type="gramEnd"/>
-      <w:r>
-        <w:t>地图资源，难适应峡谷前中后期的节奏差异。</w:t>
-      </w:r>
-      <w:proofErr w:type="gramStart"/>
-      <w:r>
-        <w:t>对线期频繁</w:t>
-      </w:r>
-      <w:proofErr w:type="gramEnd"/>
-      <w:r>
-        <w:t>换血、无视</w:t>
-      </w:r>
-      <w:proofErr w:type="gramStart"/>
-      <w:r>
-        <w:t>敌方打野位置</w:t>
-      </w:r>
-      <w:proofErr w:type="gramEnd"/>
-      <w:r>
-        <w:t>，导致被抓或劣势滚雪球。出</w:t>
-      </w:r>
-      <w:proofErr w:type="gramStart"/>
-      <w:r>
-        <w:t>装容易</w:t>
-      </w:r>
-      <w:proofErr w:type="gramEnd"/>
-      <w:r>
-        <w:t>把其他模式的装备理解直接迁移至峡谷，忽视版本、模式和英雄定位差异。</w:t>
+        <w:t>，容易忽略补刀、经验、兵线和地图资源，难适应峡谷前中后期的节奏差异。对线期频繁换血、无视敌方打野位置，导致被抓或劣势滚雪球。出装容易把其他模式的装备理解直接迁移至峡谷，忽视版本、模式和英雄定位差异。</w:t>
       </w:r>
     </w:p>
     <w:p>
@@ -504,15 +387,7 @@
         <w:t>”</w:t>
       </w:r>
       <w:r>
-        <w:t>。用实战片段讲解同</w:t>
-      </w:r>
-      <w:proofErr w:type="gramStart"/>
-      <w:r>
-        <w:t>一英雄</w:t>
-      </w:r>
-      <w:proofErr w:type="gramEnd"/>
-      <w:r>
-        <w:t>在不同模式中的核心差异。给出可执行的单局目标，如</w:t>
+        <w:t>。用实战片段讲解同一英雄在不同模式中的核心差异。给出可执行的单局目标，如</w:t>
       </w:r>
       <w:r>
         <w:t>“</w:t>
@@ -529,13 +404,8 @@
       <w:r>
         <w:t>”“</w:t>
       </w:r>
-      <w:proofErr w:type="gramStart"/>
-      <w:r>
-        <w:t>不</w:t>
-      </w:r>
-      <w:proofErr w:type="gramEnd"/>
-      <w:r>
-        <w:t>无脑</w:t>
+      <w:r>
+        <w:t>不无脑</w:t>
       </w:r>
       <w:r>
         <w:t>E</w:t>
@@ -547,15 +417,7 @@
         <w:t>”</w:t>
       </w:r>
       <w:r>
-        <w:t>。提供对线、</w:t>
-      </w:r>
-      <w:proofErr w:type="gramStart"/>
-      <w:r>
-        <w:t>刷野和</w:t>
-      </w:r>
-      <w:proofErr w:type="gramEnd"/>
-      <w:r>
-        <w:t>资源节奏的复盘反馈，避免只评价</w:t>
+        <w:t>。提供对线、刷野和资源节奏的复盘反馈，避免只评价</w:t>
       </w:r>
       <w:r>
         <w:t xml:space="preserve"> KDA</w:t>
@@ -604,23 +466,13 @@
       <w:r>
         <w:t>曾长期玩过峡谷，理解英雄、分路和基本战术，但</w:t>
       </w:r>
-      <w:proofErr w:type="gramStart"/>
       <w:r>
         <w:rPr>
           <w:rStyle w:val="a4"/>
           <w:b/>
           <w:bCs w:val="0"/>
         </w:rPr>
-        <w:t>退坑时间</w:t>
-      </w:r>
-      <w:proofErr w:type="gramEnd"/>
-      <w:r>
-        <w:rPr>
-          <w:rStyle w:val="a4"/>
-          <w:b/>
-          <w:bCs w:val="0"/>
-        </w:rPr>
-        <w:t>较长</w:t>
+        <w:t>退坑时间较长</w:t>
       </w:r>
       <w:r>
         <w:t>，对当前版本的英雄强弱、装备体系、地图目标、资源节奏和主流打法不熟悉。或其</w:t>
@@ -715,15 +567,7 @@
         <w:t>”</w:t>
       </w:r>
       <w:r>
-        <w:t>。根据其历史</w:t>
-      </w:r>
-      <w:proofErr w:type="gramStart"/>
-      <w:r>
-        <w:t>主玩位置</w:t>
-      </w:r>
-      <w:proofErr w:type="gramEnd"/>
-      <w:r>
-        <w:t>和英雄池，生成个性化回归清单。</w:t>
+        <w:t>。根据其历史主玩位置和英雄池，生成个性化回归清单。</w:t>
       </w:r>
     </w:p>
     <w:p>
@@ -770,15 +614,7 @@
         </w:rPr>
       </w:pPr>
       <w:r>
-        <w:t>峡谷对局稳定、活跃，通常有明确</w:t>
-      </w:r>
-      <w:proofErr w:type="gramStart"/>
-      <w:r>
-        <w:t>主玩位置</w:t>
-      </w:r>
-      <w:proofErr w:type="gramEnd"/>
-      <w:r>
-        <w:t>和英雄池，基本操作合格，但整体段位和表现仍不稳定。</w:t>
+        <w:t>峡谷对局稳定、活跃，通常有明确主玩位置和英雄池，基本操作合格，但整体段位和表现仍不稳定。</w:t>
       </w:r>
     </w:p>
     <w:p>
@@ -806,32 +642,14 @@
       <w:r>
         <w:t>/</w:t>
       </w:r>
-      <w:proofErr w:type="gramStart"/>
       <w:r>
         <w:t>推塔数</w:t>
       </w:r>
-      <w:proofErr w:type="gramEnd"/>
       <w:r>
         <w:t>/</w:t>
       </w:r>
       <w:r>
-        <w:t>视野得分等关键节奏指标低于同段位平均值。死亡集中在</w:t>
-      </w:r>
-      <w:proofErr w:type="gramStart"/>
-      <w:r>
-        <w:t>贪兵线</w:t>
-      </w:r>
-      <w:proofErr w:type="gramEnd"/>
-      <w:r>
-        <w:t>、无视野过河、脱节、</w:t>
-      </w:r>
-      <w:proofErr w:type="gramStart"/>
-      <w:r>
-        <w:t>团战暴毙</w:t>
-      </w:r>
-      <w:proofErr w:type="gramEnd"/>
-      <w:r>
-        <w:t>。聊天记录中频繁出现抱怨队友、归因外部因素，或对自身失误缺乏认知。英雄场次多、熟练度高但战绩一般，只会操作不懂赢游戏。</w:t>
+        <w:t>视野得分等关键节奏指标低于同段位平均值。死亡集中在贪兵线、无视野过河、脱节、团战暴毙。聊天记录中频繁出现抱怨队友、归因外部因素，或对自身失误缺乏认知。英雄场次多、熟练度高但战绩一般，只会操作不懂赢游戏。</w:t>
       </w:r>
     </w:p>
     <w:p>
@@ -842,39 +660,7 @@
         <w:t>典型表现：</w:t>
       </w:r>
       <w:r>
-        <w:t>决策细节粗糙，视野布置无效、游走支援时机错误。对局势掌握能力不强，劣势</w:t>
-      </w:r>
-      <w:proofErr w:type="gramStart"/>
-      <w:r>
-        <w:t>局容易</w:t>
-      </w:r>
-      <w:proofErr w:type="gramEnd"/>
-      <w:r>
-        <w:t>上头，试图通过单带偷人或不</w:t>
-      </w:r>
-      <w:proofErr w:type="gramStart"/>
-      <w:r>
-        <w:t>理智团战一波</w:t>
-      </w:r>
-      <w:proofErr w:type="gramEnd"/>
-      <w:r>
-        <w:t>翻盘，反而扩大劣势；优势</w:t>
-      </w:r>
-      <w:proofErr w:type="gramStart"/>
-      <w:r>
-        <w:t>局不会</w:t>
-      </w:r>
-      <w:proofErr w:type="gramEnd"/>
-      <w:r>
-        <w:t>滚雪球，沉迷杀人忽略</w:t>
-      </w:r>
-      <w:proofErr w:type="gramStart"/>
-      <w:r>
-        <w:t>推塔控</w:t>
-      </w:r>
-      <w:proofErr w:type="gramEnd"/>
-      <w:r>
-        <w:t>资源，被对手拖到后期翻盘。对小地图信号、队友提示、敌方动向等关键信息感知存在但未能转化为避战或进攻行为，呈现选择性忽略。补刀或游走频次达标，但经济转化率、</w:t>
+        <w:t>决策细节粗糙，视野布置无效、游走支援时机错误。对局势掌握能力不强，劣势局容易上头，试图通过单带偷人或不理智团战一波翻盘，反而扩大劣势；优势局不会滚雪球，沉迷杀人忽略推塔控资源，被对手拖到后期翻盘。对小地图信号、队友提示、敌方动向等关键信息感知存在但未能转化为避战或进攻行为，呈现选择性忽略。补刀或游走频次达标，但经济转化率、</w:t>
       </w:r>
       <w:proofErr w:type="spellStart"/>
       <w:r>
@@ -893,15 +679,7 @@
         <w:t>服务内容：</w:t>
       </w:r>
       <w:r>
-        <w:t>实时决策轻量提醒，在检测到连续死亡、经济落后、情绪指标异常时触发避战与发育建议；在检测到敌方关键技能真空、落单或资源窗口时触发进攻或压制提示。对于高频掉点掉节奏的情况与具体位置、时机、视野缺失等要素绑定，提出决策改进空间。局后复盘以具体对局片段为单位输出可执行改进点，聚焦决策节点而非操作细节，明确替代方案与预期收益。在玩家经历连败或高压对局后，量化当前局势的可挽回性，阻断情绪崩溃导致</w:t>
-      </w:r>
-      <w:proofErr w:type="gramStart"/>
-      <w:r>
-        <w:t>的摆烂行为</w:t>
-      </w:r>
-      <w:proofErr w:type="gramEnd"/>
-      <w:r>
-        <w:t>。对比用户局内习惯与版本最优解的差异，解释背后数值或机制逻辑的差异，引导玩家学会</w:t>
+        <w:t>实时决策轻量提醒，在检测到连续死亡、经济落后、情绪指标异常时触发避战与发育建议；在检测到敌方关键技能真空、落单或资源窗口时触发进攻或压制提示。对于高频掉点掉节奏的情况与具体位置、时机、视野缺失等要素绑定，提出决策改进空间。局后复盘以具体对局片段为单位输出可执行改进点，聚焦决策节点而非操作细节，明确替代方案与预期收益。在玩家经历连败或高压对局后，量化当前局势的可挽回性，阻断情绪崩溃导致的摆烂行为。对比用户局内习惯与版本最优解的差异，解释背后数值或机制逻辑的差异，引导玩家学会</w:t>
       </w:r>
       <w:r>
         <w:t>“</w:t>
@@ -986,15 +764,7 @@
         <w:t>APM</w:t>
       </w:r>
       <w:r>
-        <w:t>、反应时间、鼠标轨迹等），分析游戏时</w:t>
-      </w:r>
-      <w:proofErr w:type="gramStart"/>
-      <w:r>
-        <w:t>长导致</w:t>
-      </w:r>
-      <w:proofErr w:type="gramEnd"/>
-      <w:r>
-        <w:t>的疲劳度与专注力曲线，提供休息建议或状态优化方案。提前推送测试服改动、职业赛场新套路、高分段新兴冷门玩法的深度解析，提供改动影响模拟功能，帮助用户预判版本变化对自身英雄池与打法的影响。</w:t>
+        <w:t>、反应时间、鼠标轨迹等），分析游戏时长导致的疲劳度与专注力曲线，提供休息建议或状态优化方案。提前推送测试服改动、职业赛场新套路、高分段新兴冷门玩法的深度解析，提供改动影响模拟功能，帮助用户预判版本变化对自身英雄池与打法的影响。</w:t>
       </w:r>
     </w:p>
     <w:p>
@@ -1290,25 +1060,7 @@
                 <w:sz w:val="22"/>
                 <w:szCs w:val="22"/>
               </w:rPr>
-              <w:t>英雄、第一次回城、首个地图资源、</w:t>
-            </w:r>
-            <w:proofErr w:type="gramStart"/>
-            <w:r>
-              <w:rPr>
-                <w:color w:val="000000"/>
-                <w:sz w:val="22"/>
-                <w:szCs w:val="22"/>
-              </w:rPr>
-              <w:t>首次团战</w:t>
-            </w:r>
-            <w:proofErr w:type="gramEnd"/>
-            <w:r>
-              <w:rPr>
-                <w:color w:val="000000"/>
-                <w:sz w:val="22"/>
-                <w:szCs w:val="22"/>
-              </w:rPr>
-              <w:t>、赛后</w:t>
+              <w:t>英雄、第一次回城、首个地图资源、首次团战、赛后</w:t>
             </w:r>
           </w:p>
         </w:tc>
@@ -1478,36 +1230,8 @@
                 <w:sz w:val="22"/>
                 <w:szCs w:val="22"/>
               </w:rPr>
-              <w:t>同英雄</w:t>
-            </w:r>
-            <w:proofErr w:type="gramStart"/>
-            <w:r>
-              <w:rPr>
-                <w:color w:val="000000"/>
-                <w:sz w:val="22"/>
-                <w:szCs w:val="22"/>
-              </w:rPr>
-              <w:t>跨模式</w:t>
-            </w:r>
-            <w:proofErr w:type="gramEnd"/>
-            <w:r>
-              <w:rPr>
-                <w:color w:val="000000"/>
-                <w:sz w:val="22"/>
-                <w:szCs w:val="22"/>
-              </w:rPr>
-              <w:t>差异、</w:t>
-            </w:r>
-            <w:proofErr w:type="gramStart"/>
-            <w:r>
-              <w:rPr>
-                <w:color w:val="000000"/>
-                <w:sz w:val="22"/>
-                <w:szCs w:val="22"/>
-              </w:rPr>
-              <w:t>兵线</w:t>
-            </w:r>
-            <w:proofErr w:type="gramEnd"/>
+              <w:t>同英雄跨模式差异、兵线</w:t>
+            </w:r>
             <w:r>
               <w:rPr>
                 <w:color w:val="000000"/>
@@ -2466,23 +2190,13 @@
               </w:rPr>
               <w:t xml:space="preserve"> 3 </w:t>
             </w:r>
-            <w:proofErr w:type="gramStart"/>
-            <w:r>
-              <w:rPr>
-                <w:color w:val="000000"/>
-                <w:sz w:val="22"/>
-                <w:szCs w:val="22"/>
-              </w:rPr>
-              <w:t>个</w:t>
-            </w:r>
-            <w:proofErr w:type="gramEnd"/>
-            <w:r>
-              <w:rPr>
-                <w:color w:val="000000"/>
-                <w:sz w:val="22"/>
-                <w:szCs w:val="22"/>
-              </w:rPr>
-              <w:t>英雄卡；每张说明</w:t>
+            <w:r>
+              <w:rPr>
+                <w:color w:val="000000"/>
+                <w:sz w:val="22"/>
+                <w:szCs w:val="22"/>
+              </w:rPr>
+              <w:t>个英雄卡；每张说明</w:t>
             </w:r>
             <w:r>
               <w:rPr>
@@ -2540,41 +2254,13 @@
                 <w:szCs w:val="22"/>
               </w:rPr>
             </w:pPr>
-            <w:proofErr w:type="gramStart"/>
-            <w:r>
-              <w:rPr>
-                <w:color w:val="000000"/>
-                <w:sz w:val="22"/>
-                <w:szCs w:val="22"/>
-              </w:rPr>
-              <w:t>不</w:t>
-            </w:r>
-            <w:proofErr w:type="gramEnd"/>
-            <w:r>
-              <w:rPr>
-                <w:color w:val="000000"/>
-                <w:sz w:val="22"/>
-                <w:szCs w:val="22"/>
-              </w:rPr>
-              <w:t>自动锁定；</w:t>
-            </w:r>
-            <w:proofErr w:type="gramStart"/>
-            <w:r>
-              <w:rPr>
-                <w:color w:val="000000"/>
-                <w:sz w:val="22"/>
-                <w:szCs w:val="22"/>
-              </w:rPr>
-              <w:t>不只按</w:t>
-            </w:r>
-            <w:proofErr w:type="gramEnd"/>
-            <w:r>
-              <w:rPr>
-                <w:color w:val="000000"/>
-                <w:sz w:val="22"/>
-                <w:szCs w:val="22"/>
-              </w:rPr>
-              <w:t>胜率推荐；不披露队友的隐藏偏好、历史战绩或个人标签</w:t>
+            <w:r>
+              <w:rPr>
+                <w:color w:val="000000"/>
+                <w:sz w:val="22"/>
+                <w:szCs w:val="22"/>
+              </w:rPr>
+              <w:t>不自动锁定；不只按胜率推荐；不披露队友的隐藏偏好、历史战绩或个人标签</w:t>
             </w:r>
           </w:p>
         </w:tc>
@@ -2750,23 +2436,13 @@
               </w:rPr>
               <w:t xml:space="preserve"> + 1 </w:t>
             </w:r>
-            <w:proofErr w:type="gramStart"/>
-            <w:r>
-              <w:rPr>
-                <w:color w:val="000000"/>
-                <w:sz w:val="22"/>
-                <w:szCs w:val="22"/>
-              </w:rPr>
-              <w:t>个</w:t>
-            </w:r>
-            <w:proofErr w:type="gramEnd"/>
-            <w:r>
-              <w:rPr>
-                <w:color w:val="000000"/>
-                <w:sz w:val="22"/>
-                <w:szCs w:val="22"/>
-              </w:rPr>
-              <w:t>可解释备选；显示适用条件和切换节点</w:t>
+            <w:r>
+              <w:rPr>
+                <w:color w:val="000000"/>
+                <w:sz w:val="22"/>
+                <w:szCs w:val="22"/>
+              </w:rPr>
+              <w:t>个可解释备选；显示适用条件和切换节点</w:t>
             </w:r>
           </w:p>
         </w:tc>
@@ -2829,23 +2505,13 @@
                 <w:szCs w:val="22"/>
               </w:rPr>
             </w:pPr>
-            <w:proofErr w:type="gramStart"/>
-            <w:r>
-              <w:rPr>
-                <w:color w:val="000000"/>
-                <w:sz w:val="22"/>
-                <w:szCs w:val="22"/>
-              </w:rPr>
-              <w:t>连招与玩法</w:t>
-            </w:r>
-            <w:proofErr w:type="gramEnd"/>
-            <w:r>
-              <w:rPr>
-                <w:color w:val="000000"/>
-                <w:sz w:val="22"/>
-                <w:szCs w:val="22"/>
-              </w:rPr>
-              <w:t>思路</w:t>
+            <w:r>
+              <w:rPr>
+                <w:color w:val="000000"/>
+                <w:sz w:val="22"/>
+                <w:szCs w:val="22"/>
+              </w:rPr>
+              <w:t>连招与玩法思路</w:t>
             </w:r>
           </w:p>
         </w:tc>
@@ -3258,25 +2924,7 @@
                 <w:sz w:val="22"/>
                 <w:szCs w:val="22"/>
               </w:rPr>
-              <w:t>只使用公开阵容信息；不推断或展示其他</w:t>
-            </w:r>
-            <w:proofErr w:type="gramStart"/>
-            <w:r>
-              <w:rPr>
-                <w:color w:val="000000"/>
-                <w:sz w:val="22"/>
-                <w:szCs w:val="22"/>
-              </w:rPr>
-              <w:t>玩家未</w:t>
-            </w:r>
-            <w:proofErr w:type="gramEnd"/>
-            <w:r>
-              <w:rPr>
-                <w:color w:val="000000"/>
-                <w:sz w:val="22"/>
-                <w:szCs w:val="22"/>
-              </w:rPr>
-              <w:t>公开的风格、段位、历史和意图；不把建议变成强制指挥</w:t>
+              <w:t>只使用公开阵容信息；不推断或展示其他玩家未公开的风格、段位、历史和意图；不把建议变成强制指挥</w:t>
             </w:r>
           </w:p>
         </w:tc>
@@ -3816,23 +3464,13 @@
                 <w:szCs w:val="22"/>
               </w:rPr>
             </w:pPr>
-            <w:proofErr w:type="gramStart"/>
-            <w:r>
-              <w:rPr>
-                <w:color w:val="000000"/>
-                <w:sz w:val="22"/>
-                <w:szCs w:val="22"/>
-              </w:rPr>
-              <w:t>兵线状态</w:t>
-            </w:r>
-            <w:proofErr w:type="gramEnd"/>
-            <w:r>
-              <w:rPr>
-                <w:color w:val="000000"/>
-                <w:sz w:val="22"/>
-                <w:szCs w:val="22"/>
-              </w:rPr>
-              <w:t>、炮车波、补刀差、经验差、玩家当前战斗状态</w:t>
+            <w:r>
+              <w:rPr>
+                <w:color w:val="000000"/>
+                <w:sz w:val="22"/>
+                <w:szCs w:val="22"/>
+              </w:rPr>
+              <w:t>兵线状态、炮车波、补刀差、经验差、玩家当前战斗状态</w:t>
             </w:r>
           </w:p>
         </w:tc>
@@ -3999,7 +3637,6 @@
                 <w:szCs w:val="22"/>
               </w:rPr>
             </w:pPr>
-            <w:proofErr w:type="gramStart"/>
             <w:r>
               <w:rPr>
                 <w:color w:val="000000"/>
@@ -4008,7 +3645,6 @@
               </w:rPr>
               <w:t>抢二</w:t>
             </w:r>
-            <w:proofErr w:type="gramEnd"/>
             <w:r>
               <w:rPr>
                 <w:color w:val="000000"/>
@@ -4055,25 +3691,7 @@
                 <w:sz w:val="22"/>
                 <w:szCs w:val="22"/>
               </w:rPr>
-              <w:t>双方已获得经验、</w:t>
-            </w:r>
-            <w:proofErr w:type="gramStart"/>
-            <w:r>
-              <w:rPr>
-                <w:color w:val="000000"/>
-                <w:sz w:val="22"/>
-                <w:szCs w:val="22"/>
-              </w:rPr>
-              <w:t>当前兵线和</w:t>
-            </w:r>
-            <w:proofErr w:type="gramEnd"/>
-            <w:r>
-              <w:rPr>
-                <w:color w:val="000000"/>
-                <w:sz w:val="22"/>
-                <w:szCs w:val="22"/>
-              </w:rPr>
-              <w:t>英雄技能条件</w:t>
+              <w:t>双方已获得经验、当前兵线和英雄技能条件</w:t>
             </w:r>
           </w:p>
         </w:tc>
@@ -4161,25 +3779,7 @@
                 <w:sz w:val="22"/>
                 <w:szCs w:val="22"/>
               </w:rPr>
-              <w:t>不鼓励无条件硬拼；敌方有明显反</w:t>
-            </w:r>
-            <w:proofErr w:type="gramStart"/>
-            <w:r>
-              <w:rPr>
-                <w:color w:val="000000"/>
-                <w:sz w:val="22"/>
-                <w:szCs w:val="22"/>
-              </w:rPr>
-              <w:t>打条件</w:t>
-            </w:r>
-            <w:proofErr w:type="gramEnd"/>
-            <w:r>
-              <w:rPr>
-                <w:color w:val="000000"/>
-                <w:sz w:val="22"/>
-                <w:szCs w:val="22"/>
-              </w:rPr>
-              <w:t>时提示</w:t>
+              <w:t>不鼓励无条件硬拼；敌方有明显反打条件时提示</w:t>
             </w:r>
             <w:r>
               <w:rPr>
@@ -4291,25 +3891,7 @@
                 <w:sz w:val="22"/>
                 <w:szCs w:val="22"/>
               </w:rPr>
-              <w:t>自身视野、敌方已公开出现的位置、线上消失时长、</w:t>
-            </w:r>
-            <w:proofErr w:type="gramStart"/>
-            <w:r>
-              <w:rPr>
-                <w:color w:val="000000"/>
-                <w:sz w:val="22"/>
-                <w:szCs w:val="22"/>
-              </w:rPr>
-              <w:t>兵线深入</w:t>
-            </w:r>
-            <w:proofErr w:type="gramEnd"/>
-            <w:r>
-              <w:rPr>
-                <w:color w:val="000000"/>
-                <w:sz w:val="22"/>
-                <w:szCs w:val="22"/>
-              </w:rPr>
-              <w:t>、己方队友信号</w:t>
+              <w:t>自身视野、敌方已公开出现的位置、线上消失时长、兵线深入、己方队友信号</w:t>
             </w:r>
           </w:p>
         </w:tc>
@@ -4570,25 +4152,7 @@
                 <w:sz w:val="22"/>
                 <w:szCs w:val="22"/>
               </w:rPr>
-              <w:t>开局时，以及</w:t>
-            </w:r>
-            <w:proofErr w:type="gramStart"/>
-            <w:r>
-              <w:rPr>
-                <w:color w:val="000000"/>
-                <w:sz w:val="22"/>
-                <w:szCs w:val="22"/>
-              </w:rPr>
-              <w:t>打野正常刷</w:t>
-            </w:r>
-            <w:proofErr w:type="gramEnd"/>
-            <w:r>
-              <w:rPr>
-                <w:color w:val="000000"/>
-                <w:sz w:val="22"/>
-                <w:szCs w:val="22"/>
-              </w:rPr>
-              <w:t>完一个半区前的时间节点，</w:t>
+              <w:t>开局时，以及打野正常刷完一个半区前的时间节点，</w:t>
             </w:r>
             <w:r>
               <w:rPr>
@@ -4666,15 +4230,7 @@
         </w:rPr>
       </w:pPr>
       <w:r>
-        <w:t>B2. 中期转线、</w:t>
-      </w:r>
-      <w:proofErr w:type="gramStart"/>
-      <w:r>
-        <w:t>推塔和</w:t>
-      </w:r>
-      <w:proofErr w:type="gramEnd"/>
-      <w:r>
-        <w:t>运营</w:t>
+        <w:t>B2. 中期转线、推塔和运营</w:t>
       </w:r>
     </w:p>
     <w:tbl>
@@ -4869,7 +4425,6 @@
                 <w:szCs w:val="22"/>
               </w:rPr>
             </w:pPr>
-            <w:proofErr w:type="gramStart"/>
             <w:r>
               <w:rPr>
                 <w:color w:val="000000"/>
@@ -4878,7 +4433,6 @@
               </w:rPr>
               <w:t>推塔窗口</w:t>
             </w:r>
-            <w:proofErr w:type="gramEnd"/>
           </w:p>
         </w:tc>
         <w:tc>
@@ -5058,25 +4612,7 @@
                 <w:sz w:val="22"/>
                 <w:szCs w:val="22"/>
               </w:rPr>
-              <w:t>视野与经过</w:t>
-            </w:r>
-            <w:proofErr w:type="gramStart"/>
-            <w:r>
-              <w:rPr>
-                <w:color w:val="000000"/>
-                <w:sz w:val="22"/>
-                <w:szCs w:val="22"/>
-              </w:rPr>
-              <w:t>盲</w:t>
-            </w:r>
-            <w:proofErr w:type="gramEnd"/>
-            <w:r>
-              <w:rPr>
-                <w:color w:val="000000"/>
-                <w:sz w:val="22"/>
-                <w:szCs w:val="22"/>
-              </w:rPr>
-              <w:t>视野区域</w:t>
+              <w:t>视野与经过盲视野区域</w:t>
             </w:r>
           </w:p>
         </w:tc>
@@ -5305,25 +4841,7 @@
                 <w:sz w:val="22"/>
                 <w:szCs w:val="22"/>
               </w:rPr>
-              <w:t>大龙刷新计时、队伍人数、</w:t>
-            </w:r>
-            <w:proofErr w:type="gramStart"/>
-            <w:r>
-              <w:rPr>
-                <w:color w:val="000000"/>
-                <w:sz w:val="22"/>
-                <w:szCs w:val="22"/>
-              </w:rPr>
-              <w:t>兵线和</w:t>
-            </w:r>
-            <w:proofErr w:type="gramEnd"/>
-            <w:r>
-              <w:rPr>
-                <w:color w:val="000000"/>
-                <w:sz w:val="22"/>
-                <w:szCs w:val="22"/>
-              </w:rPr>
-              <w:t>回城状态</w:t>
+              <w:t>大龙刷新计时、队伍人数、兵线和回城状态</w:t>
             </w:r>
           </w:p>
         </w:tc>
@@ -5863,25 +5381,7 @@
                 <w:sz w:val="22"/>
                 <w:szCs w:val="22"/>
               </w:rPr>
-              <w:t>资源、视野、</w:t>
-            </w:r>
-            <w:proofErr w:type="gramStart"/>
-            <w:r>
-              <w:rPr>
-                <w:color w:val="000000"/>
-                <w:sz w:val="22"/>
-                <w:szCs w:val="22"/>
-              </w:rPr>
-              <w:t>兵线和</w:t>
-            </w:r>
-            <w:proofErr w:type="gramEnd"/>
-            <w:r>
-              <w:rPr>
-                <w:color w:val="000000"/>
-                <w:sz w:val="22"/>
-                <w:szCs w:val="22"/>
-              </w:rPr>
-              <w:t>人数</w:t>
+              <w:t>资源、视野、兵线和人数</w:t>
             </w:r>
           </w:p>
         </w:tc>
@@ -5977,43 +5477,7 @@
                 <w:sz w:val="22"/>
                 <w:szCs w:val="22"/>
               </w:rPr>
-              <w:t>不</w:t>
-            </w:r>
-            <w:proofErr w:type="gramStart"/>
-            <w:r>
-              <w:rPr>
-                <w:color w:val="000000"/>
-                <w:sz w:val="22"/>
-                <w:szCs w:val="22"/>
-              </w:rPr>
-              <w:t>承诺团战</w:t>
-            </w:r>
-            <w:proofErr w:type="gramEnd"/>
-            <w:r>
-              <w:rPr>
-                <w:color w:val="000000"/>
-                <w:sz w:val="22"/>
-                <w:szCs w:val="22"/>
-              </w:rPr>
-              <w:t>结果；不代替玩家判断</w:t>
-            </w:r>
-            <w:proofErr w:type="gramStart"/>
-            <w:r>
-              <w:rPr>
-                <w:color w:val="000000"/>
-                <w:sz w:val="22"/>
-                <w:szCs w:val="22"/>
-              </w:rPr>
-              <w:t>开团目标</w:t>
-            </w:r>
-            <w:proofErr w:type="gramEnd"/>
-            <w:r>
-              <w:rPr>
-                <w:color w:val="000000"/>
-                <w:sz w:val="22"/>
-                <w:szCs w:val="22"/>
-              </w:rPr>
-              <w:t>和时机</w:t>
+              <w:t>不承诺团战结果；不代替玩家判断开团目标和时机</w:t>
             </w:r>
           </w:p>
         </w:tc>
@@ -6226,25 +5690,7 @@
                 <w:sz w:val="22"/>
                 <w:szCs w:val="22"/>
               </w:rPr>
-              <w:t>不指示去未有合法信息的危险区域；单</w:t>
-            </w:r>
-            <w:proofErr w:type="gramStart"/>
-            <w:r>
-              <w:rPr>
-                <w:color w:val="000000"/>
-                <w:sz w:val="22"/>
-                <w:szCs w:val="22"/>
-              </w:rPr>
-              <w:t>带建议</w:t>
-            </w:r>
-            <w:proofErr w:type="gramEnd"/>
-            <w:r>
-              <w:rPr>
-                <w:color w:val="000000"/>
-                <w:sz w:val="22"/>
-                <w:szCs w:val="22"/>
-              </w:rPr>
-              <w:t>必须包含撤退条件</w:t>
+              <w:t>不指示去未有合法信息的危险区域；单带建议必须包含撤退条件</w:t>
             </w:r>
           </w:p>
         </w:tc>
@@ -6723,7 +6169,6 @@
               </w:rPr>
               <w:t>/</w:t>
             </w:r>
-            <w:proofErr w:type="gramStart"/>
             <w:r>
               <w:rPr>
                 <w:color w:val="000000"/>
@@ -6732,7 +6177,6 @@
               </w:rPr>
               <w:t>贪线</w:t>
             </w:r>
-            <w:proofErr w:type="gramEnd"/>
           </w:p>
         </w:tc>
         <w:tc>
@@ -7284,7 +6728,6 @@
                 <w:szCs w:val="22"/>
               </w:rPr>
             </w:pPr>
-            <w:proofErr w:type="gramStart"/>
             <w:r>
               <w:rPr>
                 <w:color w:val="000000"/>
@@ -7293,7 +6736,6 @@
               </w:rPr>
               <w:t>盲视野被阴</w:t>
             </w:r>
-            <w:proofErr w:type="gramEnd"/>
           </w:p>
         </w:tc>
         <w:tc>
@@ -7620,15 +7062,7 @@
         </w:numPr>
       </w:pPr>
       <w:r>
-        <w:t>是否因阵容强势</w:t>
-      </w:r>
-      <w:proofErr w:type="gramStart"/>
-      <w:r>
-        <w:t>期判断</w:t>
-      </w:r>
-      <w:proofErr w:type="gramEnd"/>
-      <w:r>
-        <w:t>错误而在不利时间接战。</w:t>
+        <w:t>是否因阵容强势期判断错误而在不利时间接战。</w:t>
       </w:r>
     </w:p>
     <w:p>
@@ -7717,23 +7151,7 @@
         <w:t xml:space="preserve"> 45 </w:t>
       </w:r>
       <w:r>
-        <w:t>秒刷新。更稳选择是提前</w:t>
-      </w:r>
-      <w:proofErr w:type="gramStart"/>
-      <w:r>
-        <w:t>推完线并</w:t>
-      </w:r>
-      <w:proofErr w:type="gramEnd"/>
-      <w:r>
-        <w:t>回城，收益是能与队伍同时到小龙坑站位，更容易</w:t>
-      </w:r>
-      <w:proofErr w:type="gramStart"/>
-      <w:r>
-        <w:t>让团战</w:t>
-      </w:r>
-      <w:proofErr w:type="gramEnd"/>
-      <w:r>
-        <w:t>胜利并且能拿下小龙，进一步为即将到来的大龙视野攻防战提前准备。</w:t>
+        <w:t>秒刷新。更稳选择是提前推完线并回城，收益是能与队伍同时到小龙坑站位，更容易让团战胜利并且能拿下小龙，进一步为即将到来的大龙视野攻防战提前准备。</w:t>
       </w:r>
     </w:p>
     <w:p>
@@ -7785,23 +7203,7 @@
         </w:numPr>
       </w:pPr>
       <w:r>
-        <w:t>中后期是否根据阵容强势</w:t>
-      </w:r>
-      <w:proofErr w:type="gramStart"/>
-      <w:r>
-        <w:t>期选择</w:t>
-      </w:r>
-      <w:proofErr w:type="gramEnd"/>
-      <w:r>
-        <w:t>抱团、单带、</w:t>
-      </w:r>
-      <w:proofErr w:type="gramStart"/>
-      <w:r>
-        <w:t>逼资源</w:t>
-      </w:r>
-      <w:proofErr w:type="gramEnd"/>
-      <w:r>
-        <w:t>或换塔。</w:t>
+        <w:t>中后期是否根据阵容强势期选择抱团、单带、逼资源或换塔。</w:t>
       </w:r>
     </w:p>
     <w:p>
@@ -7839,13 +7241,8 @@
       </w:r>
     </w:p>
     <w:p>
-      <w:proofErr w:type="gramStart"/>
-      <w:r>
-        <w:t>差异化话术</w:t>
-      </w:r>
-      <w:proofErr w:type="gramEnd"/>
-      <w:r>
-        <w:t>策略是针对不同玩家在同一场景下，判断问题的成因、当前最值得介入的目标，以及系统应以何种粒度和时机提供帮助。对不同玩家而言，问题可能完全不同：新手是不知道规则，回流玩家是旧经验失效，普通活跃玩家是决策链不稳定，高段位玩家则可能是主动用个人经济交换地图收益。</w:t>
+      <w:r>
+        <w:t>差异化话术策略是针对不同玩家在同一场景下，判断问题的成因、当前最值得介入的目标，以及系统应以何种粒度和时机提供帮助。对不同玩家而言，问题可能完全不同：新手是不知道规则，回流玩家是旧经验失效，普通活跃玩家是决策链不稳定，高段位玩家则可能是主动用个人经济交换地图收益。</w:t>
       </w:r>
     </w:p>
     <w:p>
@@ -7867,15 +7264,7 @@
         <w:t>10</w:t>
       </w:r>
       <w:r>
-        <w:t>分钟</w:t>
-      </w:r>
-      <w:proofErr w:type="gramStart"/>
-      <w:r>
-        <w:t>对线期即将</w:t>
-      </w:r>
-      <w:proofErr w:type="gramEnd"/>
-      <w:r>
-        <w:t>结束，</w:t>
+        <w:t>分钟对线期即将结束，</w:t>
       </w:r>
       <w:r>
         <w:t>“</w:t>
@@ -7915,62 +7304,22 @@
     </w:p>
     <w:p>
       <w:r>
-        <w:t>对新手玩家，问题可能是不了解必须通过最后一击才能获得小兵经济，不知道炮车更有价值，也不</w:t>
-      </w:r>
-      <w:proofErr w:type="gramStart"/>
-      <w:r>
-        <w:t>清楚漏刀会</w:t>
-      </w:r>
-      <w:proofErr w:type="gramEnd"/>
-      <w:r>
-        <w:t>影响装备购买时间。</w:t>
-      </w:r>
-    </w:p>
-    <w:p>
-      <w:r>
-        <w:t>对回流玩家，基础规则已掌握，但可能不知道当前版本的装备价格、英雄清线能力、</w:t>
-      </w:r>
-      <w:proofErr w:type="gramStart"/>
-      <w:r>
-        <w:t>兵线节奏</w:t>
-      </w:r>
-      <w:proofErr w:type="gramEnd"/>
-      <w:r>
-        <w:t>或资源优先级已经变化，放弃补刀去获取其他低优先级的收益。</w:t>
-      </w:r>
-    </w:p>
-    <w:p>
-      <w:r>
-        <w:t>对普通活跃玩家，补</w:t>
-      </w:r>
-      <w:proofErr w:type="gramStart"/>
-      <w:r>
-        <w:t>刀本身</w:t>
-      </w:r>
-      <w:proofErr w:type="gramEnd"/>
-      <w:r>
-        <w:t>通常不是知识问题，而是因为换血、游走、回城、</w:t>
-      </w:r>
-      <w:proofErr w:type="gramStart"/>
-      <w:r>
-        <w:t>贪线死亡</w:t>
-      </w:r>
-      <w:proofErr w:type="gramEnd"/>
-      <w:r>
-        <w:t>等决策导致无法稳定吃线。</w:t>
-      </w:r>
-    </w:p>
-    <w:p>
-      <w:r>
-        <w:t>对高段位玩家，补</w:t>
-      </w:r>
-      <w:proofErr w:type="gramStart"/>
-      <w:r>
-        <w:t>刀落后</w:t>
-      </w:r>
-      <w:proofErr w:type="gramEnd"/>
-      <w:r>
-        <w:t>甚至可能是有意为之，例如让线换取支援、河道控制、野区入侵、先锋或小龙节奏。</w:t>
+        <w:t>对新手玩家，问题可能是不了解必须通过最后一击才能获得小兵经济，不知道炮车更有价值，也不清楚漏刀会影响装备购买时间。</w:t>
+      </w:r>
+    </w:p>
+    <w:p>
+      <w:r>
+        <w:t>对回流玩家，基础规则已掌握，但可能不知道当前版本的装备价格、英雄清线能力、兵线节奏或资源优先级已经变化，放弃补刀去获取其他低优先级的收益。</w:t>
+      </w:r>
+    </w:p>
+    <w:p>
+      <w:r>
+        <w:t>对普通活跃玩家，补刀本身通常不是知识问题，而是因为换血、游走、回城、贪线死亡等决策导致无法稳定吃线。</w:t>
+      </w:r>
+    </w:p>
+    <w:p>
+      <w:r>
+        <w:t>对高段位玩家，补刀落后甚至可能是有意为之，例如让线换取支援、河道控制、野区入侵、先锋或小龙节奏。</w:t>
       </w:r>
     </w:p>
     <w:p>
@@ -7994,66 +7343,18 @@
     </w:p>
     <w:p>
       <w:r>
-        <w:t>对于新手，系统应提供步骤单一、思考难度低、操作量小的提示。例如提醒其先安全吃完当前兵线，而不是要求其同时</w:t>
-      </w:r>
-      <w:proofErr w:type="gramStart"/>
-      <w:r>
-        <w:t>判断兵线位置</w:t>
-      </w:r>
-      <w:proofErr w:type="gramEnd"/>
-      <w:r>
-        <w:t>、</w:t>
-      </w:r>
-      <w:proofErr w:type="gramStart"/>
-      <w:r>
-        <w:t>敌方打野路线</w:t>
-      </w:r>
-      <w:proofErr w:type="gramEnd"/>
-      <w:r>
-        <w:t>、己方支援距离、技能冷却和资源刷新时间。</w:t>
-      </w:r>
-    </w:p>
-    <w:p>
-      <w:r>
-        <w:t>对于普通活跃玩家，可以给出</w:t>
-      </w:r>
-      <w:proofErr w:type="gramStart"/>
-      <w:r>
-        <w:t>带条件</w:t>
-      </w:r>
-      <w:proofErr w:type="gramEnd"/>
-      <w:r>
-        <w:t>的决策建议。例如</w:t>
-      </w:r>
-      <w:proofErr w:type="gramStart"/>
-      <w:r>
-        <w:t>当前兵线靠近</w:t>
-      </w:r>
-      <w:proofErr w:type="gramEnd"/>
-      <w:r>
-        <w:t>敌方一侧、河道无视野、敌方中野消失时，建议放弃部分补刀，先等待</w:t>
-      </w:r>
-      <w:proofErr w:type="gramStart"/>
-      <w:r>
-        <w:t>兵线回推</w:t>
-      </w:r>
-      <w:proofErr w:type="gramEnd"/>
-      <w:r>
-        <w:t>或补充视野。击杀对手后，不建议继续追击，把线卡在己方半区安稳发育</w:t>
+        <w:t>对于新手，系统应提供步骤单一、思考难度低、操作量小的提示。例如提醒其先安全吃完当前兵线，而不是要求其同时判断兵线位置、敌方打野路线、己方支援距离、技能冷却和资源刷新时间。</w:t>
+      </w:r>
+    </w:p>
+    <w:p>
+      <w:r>
+        <w:t>对于普通活跃玩家，可以给出带条件的决策建议。例如当前兵线靠近敌方一侧、河道无视野、敌方中野消失时，建议放弃部分补刀，先等待兵线回推或补充视野。击杀对手后，不建议继续追击，把线卡在己方半区安稳发育</w:t>
       </w:r>
       <w:r>
         <w:t>/</w:t>
       </w:r>
       <w:r>
-        <w:t>推</w:t>
-      </w:r>
-      <w:proofErr w:type="gramStart"/>
-      <w:r>
-        <w:t>线进塔制造回推</w:t>
-      </w:r>
-      <w:proofErr w:type="gramEnd"/>
-      <w:r>
-        <w:t>线，持续扩大经济优势。</w:t>
+        <w:t>推线进塔制造回推线，持续扩大经济优势。</w:t>
       </w:r>
     </w:p>
     <w:p>
@@ -8280,69 +7581,37 @@
                 <w:sz w:val="22"/>
                 <w:szCs w:val="22"/>
               </w:rPr>
-              <w:t>漏掉</w:t>
-            </w:r>
-            <w:proofErr w:type="gramStart"/>
-            <w:r>
-              <w:rPr>
-                <w:sz w:val="22"/>
-                <w:szCs w:val="22"/>
-              </w:rPr>
-              <w:t>残血兵</w:t>
-            </w:r>
-            <w:proofErr w:type="gramEnd"/>
-            <w:r>
-              <w:rPr>
-                <w:sz w:val="22"/>
-                <w:szCs w:val="22"/>
-              </w:rPr>
-              <w:t>、塔下补刀不稳、清线技能命中率低</w:t>
-            </w:r>
-          </w:p>
-        </w:tc>
-        <w:tc>
-          <w:tcPr>
-            <w:tcW w:w="0" w:type="auto"/>
-            <w:tcBorders>
-              <w:top w:val="single" w:sz="4" w:space="0" w:color="DEE0E3"/>
-              <w:left w:val="single" w:sz="4" w:space="0" w:color="DEE0E3"/>
-              <w:bottom w:val="single" w:sz="4" w:space="0" w:color="DEE0E3"/>
-              <w:right w:val="single" w:sz="4" w:space="0" w:color="DEE0E3"/>
-            </w:tcBorders>
-            <w:noWrap/>
-            <w:vAlign w:val="center"/>
-            <w:hideMark/>
-          </w:tcPr>
-          <w:p>
-            <w:pPr>
-              <w:jc w:val="center"/>
-              <w:rPr>
-                <w:sz w:val="22"/>
-                <w:szCs w:val="22"/>
-              </w:rPr>
-            </w:pPr>
-            <w:r>
-              <w:rPr>
-                <w:sz w:val="22"/>
-                <w:szCs w:val="22"/>
-              </w:rPr>
-              <w:t>赛后提示基本功训练，补刀练习、</w:t>
-            </w:r>
-            <w:proofErr w:type="gramStart"/>
-            <w:r>
-              <w:rPr>
-                <w:sz w:val="22"/>
-                <w:szCs w:val="22"/>
-              </w:rPr>
-              <w:t>塔刀规则</w:t>
-            </w:r>
-            <w:proofErr w:type="gramEnd"/>
-            <w:r>
-              <w:rPr>
-                <w:sz w:val="22"/>
-                <w:szCs w:val="22"/>
-              </w:rPr>
-              <w:t>、技能清线时机；局内只做必要的轻提醒</w:t>
+              <w:t>漏掉残血兵、塔下补刀不稳、清线技能命中率低</w:t>
+            </w:r>
+          </w:p>
+        </w:tc>
+        <w:tc>
+          <w:tcPr>
+            <w:tcW w:w="0" w:type="auto"/>
+            <w:tcBorders>
+              <w:top w:val="single" w:sz="4" w:space="0" w:color="DEE0E3"/>
+              <w:left w:val="single" w:sz="4" w:space="0" w:color="DEE0E3"/>
+              <w:bottom w:val="single" w:sz="4" w:space="0" w:color="DEE0E3"/>
+              <w:right w:val="single" w:sz="4" w:space="0" w:color="DEE0E3"/>
+            </w:tcBorders>
+            <w:noWrap/>
+            <w:vAlign w:val="center"/>
+            <w:hideMark/>
+          </w:tcPr>
+          <w:p>
+            <w:pPr>
+              <w:jc w:val="center"/>
+              <w:rPr>
+                <w:sz w:val="22"/>
+                <w:szCs w:val="22"/>
+              </w:rPr>
+            </w:pPr>
+            <w:r>
+              <w:rPr>
+                <w:sz w:val="22"/>
+                <w:szCs w:val="22"/>
+              </w:rPr>
+              <w:t>赛后提示基本功训练，补刀练习、塔刀规则、技能清线时机；局内只做必要的轻提醒</w:t>
             </w:r>
           </w:p>
         </w:tc>
@@ -8625,23 +7894,7 @@
                 <w:sz w:val="22"/>
                 <w:szCs w:val="22"/>
               </w:rPr>
-              <w:t>为换血、游走、追击、</w:t>
-            </w:r>
-            <w:proofErr w:type="gramStart"/>
-            <w:r>
-              <w:rPr>
-                <w:sz w:val="22"/>
-                <w:szCs w:val="22"/>
-              </w:rPr>
-              <w:t>贪兵线而丢线</w:t>
-            </w:r>
-            <w:proofErr w:type="gramEnd"/>
-            <w:r>
-              <w:rPr>
-                <w:sz w:val="22"/>
-                <w:szCs w:val="22"/>
-              </w:rPr>
-              <w:t>或死亡</w:t>
+              <w:t>为换血、游走、追击、贪兵线而丢线或死亡</w:t>
             </w:r>
           </w:p>
         </w:tc>
@@ -8809,11 +8062,9 @@
       <w:r>
         <w:t xml:space="preserve"> 20 </w:t>
       </w:r>
-      <w:proofErr w:type="gramStart"/>
       <w:r>
         <w:t>个</w:t>
       </w:r>
-      <w:proofErr w:type="gramEnd"/>
       <w:r>
         <w:t>”</w:t>
       </w:r>
@@ -8830,15 +8081,7 @@
         <w:t>”</w:t>
       </w:r>
       <w:r>
-        <w:t>这类常识，都不是行动建议。建议需要玩家</w:t>
-      </w:r>
-      <w:proofErr w:type="gramStart"/>
-      <w:r>
-        <w:t>当下能</w:t>
-      </w:r>
-      <w:proofErr w:type="gramEnd"/>
-      <w:r>
-        <w:t>执行、能理解、预期收益或风险明确。</w:t>
+        <w:t>这类常识，都不是行动建议。建议需要玩家当下能执行、能理解、预期收益或风险明确。</w:t>
       </w:r>
       <w:r>
         <w:t>“</w:t>
@@ -8850,15 +8093,7 @@
         <w:t>”</w:t>
       </w:r>
       <w:r>
-        <w:t>才是可执行动作。</w:t>
-      </w:r>
-      <w:proofErr w:type="gramStart"/>
-      <w:r>
-        <w:t>不</w:t>
-      </w:r>
-      <w:proofErr w:type="gramEnd"/>
-      <w:r>
-        <w:t>不同玩家类型的建议内容和深度也不同。</w:t>
+        <w:t>才是可执行动作。不不同玩家类型的建议内容和深度也不同。</w:t>
       </w:r>
     </w:p>
     <w:p>
@@ -8899,15 +8134,7 @@
         <w:t>”</w:t>
       </w:r>
       <w:r>
-        <w:t>。普通活跃玩家：一个</w:t>
-      </w:r>
-      <w:proofErr w:type="gramStart"/>
-      <w:r>
-        <w:t>带条件</w:t>
-      </w:r>
-      <w:proofErr w:type="gramEnd"/>
-      <w:r>
-        <w:t>的替代路径，例如</w:t>
+        <w:t>。普通活跃玩家：一个带条件的替代路径，例如</w:t>
       </w:r>
       <w:r>
         <w:t>“</w:t>
@@ -8919,15 +8146,7 @@
         <w:t>”</w:t>
       </w:r>
       <w:r>
-        <w:t>。高段位玩家：一组</w:t>
-      </w:r>
-      <w:proofErr w:type="gramStart"/>
-      <w:r>
-        <w:t>供判断</w:t>
-      </w:r>
-      <w:proofErr w:type="gramEnd"/>
-      <w:r>
-        <w:t>的数据，例如</w:t>
+        <w:t>。高段位玩家：一组供判断的数据，例如</w:t>
       </w:r>
       <w:r>
         <w:t>“</w:t>
@@ -8944,13 +8163,8 @@
       <w:r>
         <w:t xml:space="preserve"> TP </w:t>
       </w:r>
-      <w:proofErr w:type="gramStart"/>
-      <w:r>
-        <w:t>不</w:t>
-      </w:r>
-      <w:proofErr w:type="gramEnd"/>
-      <w:r>
-        <w:t>可用，且敌方双人组消失，收益与风险不对称</w:t>
+      <w:r>
+        <w:t>不可用，且敌方双人组消失，收益与风险不对称</w:t>
       </w:r>
       <w:r>
         <w:t>”</w:t>
@@ -8990,15 +8204,7 @@
     </w:p>
     <w:p>
       <w:r>
-        <w:t>正在补刀、换血、逃生、使用连招或团战。操作高峰期默认不解释，只保留极短、</w:t>
-      </w:r>
-      <w:proofErr w:type="gramStart"/>
-      <w:r>
-        <w:t>低亮的</w:t>
-      </w:r>
-      <w:proofErr w:type="gramEnd"/>
-      <w:r>
-        <w:t>风险提示。</w:t>
+        <w:t>正在补刀、换血、逃生、使用连招或团战。操作高峰期默认不解释，只保留极短、低亮的风险提示。</w:t>
       </w:r>
     </w:p>
     <w:p>
@@ -9036,13 +8242,8 @@
       </w:r>
     </w:p>
     <w:p>
-      <w:proofErr w:type="gramStart"/>
-      <w:r>
-        <w:t>玩家近期</w:t>
-      </w:r>
-      <w:proofErr w:type="gramEnd"/>
-      <w:r>
-        <w:t>已经多次忽略同类型提示，继续推送只会造成负反馈。</w:t>
+      <w:r>
+        <w:t>玩家近期已经多次忽略同类型提示，继续推送只会造成负反馈。</w:t>
       </w:r>
     </w:p>
     <w:p>
@@ -9057,12 +8258,10 @@
       </w:r>
     </w:p>
     <w:p>
-      <w:pPr>
+      <w:r>
         <w:rPr>
-          <w:rFonts w:hint="eastAsia"/>
+          <w:noProof/>
         </w:rPr>
-      </w:pPr>
-      <w:r>
         <w:drawing>
           <wp:inline distT="0" distB="0" distL="0" distR="0" wp14:anchorId="53EC5135" wp14:editId="7A883618">
             <wp:extent cx="5274310" cy="3025775"/>
@@ -9120,6 +8319,9 @@
     <w:p>
       <w:pPr>
         <w:pStyle w:val="2"/>
+        <w:rPr>
+          <w:rFonts w:hint="default"/>
+        </w:rPr>
       </w:pPr>
       <w:r>
         <w:rPr>
@@ -9158,15 +8360,7 @@
         <w:t xml:space="preserve"> BP </w:t>
       </w:r>
       <w:r>
-        <w:t>工作台、加载阶段计划、对局提示悬浮层和赛后复盘时间轴。</w:t>
-      </w:r>
-      <w:proofErr w:type="gramStart"/>
-      <w:r>
-        <w:t>前端只</w:t>
-      </w:r>
-      <w:proofErr w:type="gramEnd"/>
-      <w:r>
-        <w:t>负责信息展示和用户交互，不直接连</w:t>
+        <w:t>工作台、加载阶段计划、对局提示悬浮层和赛后复盘时间轴。前端只负责信息展示和用户交互，不直接连</w:t>
       </w:r>
       <w:r>
         <w:lastRenderedPageBreak/>
@@ -9188,6 +8382,9 @@
     <w:p>
       <w:pPr>
         <w:pStyle w:val="2"/>
+        <w:rPr>
+          <w:rFonts w:hint="default"/>
+        </w:rPr>
       </w:pPr>
       <w:r>
         <w:rPr>
@@ -9243,20 +8440,15 @@
         <w:t xml:space="preserve">LCU </w:t>
       </w:r>
       <w:r>
-        <w:t>的认证信息只在后端使用，浏览器</w:t>
-      </w:r>
-      <w:proofErr w:type="gramStart"/>
-      <w:r>
-        <w:t>端无法</w:t>
-      </w:r>
-      <w:proofErr w:type="gramEnd"/>
-      <w:r>
-        <w:t>获取。</w:t>
+        <w:t>的认证信息只在后端使用，浏览器端无法获取。</w:t>
       </w:r>
     </w:p>
     <w:p>
       <w:pPr>
         <w:pStyle w:val="2"/>
+        <w:rPr>
+          <w:rFonts w:hint="default"/>
+        </w:rPr>
       </w:pPr>
       <w:r>
         <w:rPr>
@@ -9334,6 +8526,9 @@
     <w:p>
       <w:pPr>
         <w:pStyle w:val="2"/>
+        <w:rPr>
+          <w:rFonts w:hint="default"/>
+        </w:rPr>
       </w:pPr>
       <w:r>
         <w:rPr>
@@ -9412,6 +8607,9 @@
     <w:p>
       <w:pPr>
         <w:pStyle w:val="2"/>
+        <w:rPr>
+          <w:rFonts w:hint="default"/>
+        </w:rPr>
       </w:pPr>
       <w:r>
         <w:rPr>
@@ -9447,13 +8645,7 @@
         <w:t>这些数据会形成跨对局闭环，使下一场比赛的推荐能够参考玩家之前的表现和改进情况。</w:t>
       </w:r>
     </w:p>
-    <w:p>
-      <w:pPr>
-        <w:rPr>
-          <w:rFonts w:hint="eastAsia"/>
-        </w:rPr>
-      </w:pPr>
-    </w:p>
+    <w:p/>
     <w:p>
       <w:pPr>
         <w:pStyle w:val="1"/>
@@ -9493,12 +8685,10 @@
       </w:r>
     </w:p>
     <w:p>
-      <w:pPr>
+      <w:r>
         <w:rPr>
-          <w:rFonts w:hint="eastAsia"/>
+          <w:noProof/>
         </w:rPr>
-      </w:pPr>
-      <w:r>
         <w:drawing>
           <wp:inline distT="0" distB="0" distL="0" distR="0" wp14:anchorId="20E46084" wp14:editId="184E97E3">
             <wp:extent cx="5274310" cy="4803775"/>
@@ -9549,26 +8739,13 @@
     </w:p>
     <w:p>
       <w:r>
-        <w:t>根据</w:t>
-      </w:r>
-      <w:proofErr w:type="gramStart"/>
-      <w:r>
-        <w:t>玩家主玩</w:t>
-      </w:r>
-      <w:proofErr w:type="gramEnd"/>
-      <w:r>
-        <w:t>位置、英雄池、熟练度、近期表现和当前模式，给出最多</w:t>
+        <w:t>根据玩家主玩位置、英雄池、熟练度、近期表现和当前模式，给出最多</w:t>
       </w:r>
       <w:r>
         <w:t xml:space="preserve"> 3 </w:t>
       </w:r>
-      <w:proofErr w:type="gramStart"/>
-      <w:r>
-        <w:t>个</w:t>
-      </w:r>
-      <w:proofErr w:type="gramEnd"/>
-      <w:r>
-        <w:t>候选英雄。</w:t>
+      <w:r>
+        <w:t>个候选英雄。</w:t>
       </w:r>
     </w:p>
     <w:p>
@@ -9616,6 +8793,9 @@
         <w:jc w:val="center"/>
       </w:pPr>
       <w:r>
+        <w:rPr>
+          <w:noProof/>
+        </w:rPr>
         <w:lastRenderedPageBreak/>
         <w:drawing>
           <wp:inline distT="0" distB="0" distL="0" distR="0" wp14:anchorId="0E9E6127" wp14:editId="6D01BEC0">
@@ -9659,7 +8839,7 @@
         <w:pStyle w:val="a5"/>
         <w:jc w:val="center"/>
         <w:rPr>
-          <w:rFonts w:ascii="宋体" w:eastAsia="宋体" w:hAnsi="宋体" w:hint="eastAsia"/>
+          <w:rFonts w:ascii="宋体" w:eastAsia="宋体" w:hAnsi="宋体"/>
         </w:rPr>
       </w:pPr>
       <w:r>
@@ -9709,13 +8889,8 @@
       </w:r>
     </w:p>
     <w:p>
-      <w:proofErr w:type="gramStart"/>
-      <w:r>
-        <w:t>不</w:t>
-      </w:r>
-      <w:proofErr w:type="gramEnd"/>
-      <w:r>
-        <w:t>基于队友和对手隐藏战绩、历史偏好或未公开信息定向</w:t>
+      <w:r>
+        <w:t>不基于队友和对手隐藏战绩、历史偏好或未公开信息定向</w:t>
       </w:r>
       <w:r>
         <w:t>Ban</w:t>
@@ -9736,13 +8911,8 @@
       </w:r>
     </w:p>
     <w:p>
-      <w:proofErr w:type="gramStart"/>
-      <w:r>
-        <w:t>随英雄</w:t>
-      </w:r>
-      <w:proofErr w:type="gramEnd"/>
-      <w:r>
-        <w:t>逐步锁定，实时展示己方已有的开团、前排、持续输出、爆发、控制、清线和单带能力。</w:t>
+      <w:r>
+        <w:t>随英雄逐步锁定，实时展示己方已有的开团、前排、持续输出、爆发、控制、清线和单带能力。</w:t>
       </w:r>
     </w:p>
     <w:p>
@@ -9832,15 +9002,7 @@
         <w:t>”</w:t>
       </w:r>
       <w:r>
-        <w:t>等目标，推荐</w:t>
-      </w:r>
-      <w:proofErr w:type="gramStart"/>
-      <w:r>
-        <w:t>随目标</w:t>
-      </w:r>
-      <w:proofErr w:type="gramEnd"/>
-      <w:r>
-        <w:t>变化。</w:t>
+        <w:t>等目标，推荐随目标变化。</w:t>
       </w:r>
     </w:p>
     <w:p>
@@ -9849,43 +9011,14 @@
       </w:r>
     </w:p>
     <w:p>
-      <w:pPr>
-        <w:rPr>
-          <w:rFonts w:hint="eastAsia"/>
-        </w:rPr>
-      </w:pPr>
-      <w:r>
-        <w:t>助手</w:t>
-      </w:r>
-      <w:proofErr w:type="gramStart"/>
-      <w:r>
-        <w:t>不</w:t>
-      </w:r>
-      <w:proofErr w:type="gramEnd"/>
-      <w:r>
-        <w:t>自动</w:t>
+      <w:r>
+        <w:t>助手不自动</w:t>
       </w:r>
       <w:r>
         <w:t>Ban</w:t>
       </w:r>
       <w:r>
-        <w:t>、</w:t>
-      </w:r>
-      <w:proofErr w:type="gramStart"/>
-      <w:r>
-        <w:t>不</w:t>
-      </w:r>
-      <w:proofErr w:type="gramEnd"/>
-      <w:r>
-        <w:t>自动锁定英雄、不替玩家完成操作；不展示其他</w:t>
-      </w:r>
-      <w:proofErr w:type="gramStart"/>
-      <w:r>
-        <w:t>玩家未</w:t>
-      </w:r>
-      <w:proofErr w:type="gramEnd"/>
-      <w:r>
-        <w:t>公开的风格、段位、历史战绩和个人标签。</w:t>
+        <w:t>、不自动锁定英雄、不替玩家完成操作；不展示其他玩家未公开的风格、段位、历史战绩和个人标签。</w:t>
       </w:r>
     </w:p>
     <w:p>
@@ -9925,12 +9058,10 @@
       </w:r>
     </w:p>
     <w:p>
-      <w:pPr>
+      <w:r>
         <w:rPr>
-          <w:rFonts w:hint="eastAsia"/>
+          <w:noProof/>
         </w:rPr>
-      </w:pPr>
-      <w:r>
         <w:lastRenderedPageBreak/>
         <w:drawing>
           <wp:inline distT="0" distB="0" distL="0" distR="0" wp14:anchorId="3A147CA3" wp14:editId="1BD01640">
@@ -10049,28 +9180,12 @@
     </w:p>
     <w:p>
       <w:r>
-        <w:t>提示对</w:t>
-      </w:r>
-      <w:proofErr w:type="gramStart"/>
-      <w:r>
-        <w:t>线双方</w:t>
-      </w:r>
-      <w:proofErr w:type="gramEnd"/>
-      <w:r>
-        <w:t>的关键强势等级、重要技能窗口和第一轮换血原则。</w:t>
-      </w:r>
-    </w:p>
-    <w:p>
-      <w:r>
-        <w:t>新手展示一个动作；普通玩家展示</w:t>
-      </w:r>
-      <w:proofErr w:type="gramStart"/>
-      <w:r>
-        <w:t>带条件</w:t>
-      </w:r>
-      <w:proofErr w:type="gramEnd"/>
-      <w:r>
-        <w:t>的建议；高段位玩家展示多变量数据与收益风险，不替其做最终判断。</w:t>
+        <w:t>提示对线双方的关键强势等级、重要技能窗口和第一轮换血原则。</w:t>
+      </w:r>
+    </w:p>
+    <w:p>
+      <w:r>
+        <w:t>新手展示一个动作；普通玩家展示带条件的建议；高段位玩家展示多变量数据与收益风险，不替其做最终判断。</w:t>
       </w:r>
     </w:p>
     <w:p>
@@ -10166,28 +9281,12 @@
     </w:p>
     <w:p>
       <w:r>
-        <w:t>回流</w:t>
-      </w:r>
-      <w:proofErr w:type="gramStart"/>
-      <w:r>
-        <w:t>玩家只</w:t>
-      </w:r>
-      <w:proofErr w:type="gramEnd"/>
-      <w:r>
-        <w:t>展示与其历史习惯相关的高影响变化，不重复完整基础教程。</w:t>
-      </w:r>
-    </w:p>
-    <w:p>
-      <w:r>
-        <w:t>模式迁移玩家展示同</w:t>
-      </w:r>
-      <w:proofErr w:type="gramStart"/>
-      <w:r>
-        <w:t>一英雄</w:t>
-      </w:r>
-      <w:proofErr w:type="gramEnd"/>
-      <w:r>
-        <w:t>在峡谷与其他模式中的核心差异。</w:t>
+        <w:t>回流玩家只展示与其历史习惯相关的高影响变化，不重复完整基础教程。</w:t>
+      </w:r>
+    </w:p>
+    <w:p>
+      <w:r>
+        <w:t>模式迁移玩家展示同一英雄在峡谷与其他模式中的核心差异。</w:t>
       </w:r>
     </w:p>
     <w:p>
@@ -10243,30 +9342,14 @@
         <w:rPr>
           <w:rStyle w:val="a4"/>
         </w:rPr>
-        <w:t>阶段目标：帮助玩家稳定获得经济和经验、识别对拼与被抓窗口，并建立正确</w:t>
-      </w:r>
-      <w:proofErr w:type="gramStart"/>
+        <w:t>阶段目标：帮助玩家稳定获得经济和经验、识别对拼与被抓窗口，并建立正确的兵线与回城节奏。</w:t>
+      </w:r>
+    </w:p>
+    <w:p>
       <w:r>
         <w:rPr>
-          <w:rStyle w:val="a4"/>
+          <w:noProof/>
         </w:rPr>
-        <w:t>的兵线与</w:t>
-      </w:r>
-      <w:proofErr w:type="gramEnd"/>
-      <w:r>
-        <w:rPr>
-          <w:rStyle w:val="a4"/>
-        </w:rPr>
-        <w:t>回城节奏。</w:t>
-      </w:r>
-    </w:p>
-    <w:p>
-      <w:pPr>
-        <w:rPr>
-          <w:rFonts w:hint="eastAsia"/>
-        </w:rPr>
-      </w:pPr>
-      <w:r>
         <w:drawing>
           <wp:inline distT="0" distB="0" distL="0" distR="0" wp14:anchorId="19FFE794" wp14:editId="29413769">
             <wp:extent cx="5274310" cy="3489960"/>
@@ -10333,26 +9416,13 @@
       </w:r>
     </w:p>
     <w:p>
-      <w:proofErr w:type="gramStart"/>
-      <w:r>
-        <w:t>区分漏刀的</w:t>
-      </w:r>
-      <w:proofErr w:type="gramEnd"/>
-      <w:r>
-        <w:t>原因是操作、知识、版本、决策还是情绪，并采用不同干预方式。</w:t>
-      </w:r>
-    </w:p>
-    <w:p>
-      <w:r>
-        <w:t>不把短期补</w:t>
-      </w:r>
-      <w:proofErr w:type="gramStart"/>
-      <w:r>
-        <w:t>刀落后</w:t>
-      </w:r>
-      <w:proofErr w:type="gramEnd"/>
-      <w:r>
-        <w:t>直接解释为对线失败。</w:t>
+      <w:r>
+        <w:t>区分漏刀的原因是操作、知识、版本、决策还是情绪，并采用不同干预方式。</w:t>
+      </w:r>
+    </w:p>
+    <w:p>
+      <w:r>
+        <w:t>不把短期补刀落后直接解释为对线失败。</w:t>
       </w:r>
     </w:p>
     <w:p>
@@ -10368,15 +9438,7 @@
     </w:p>
     <w:p>
       <w:r>
-        <w:t>在确实能先到二、先到三或到达关键技能等级时，提示准确的升级节点和</w:t>
-      </w:r>
-      <w:proofErr w:type="gramStart"/>
-      <w:r>
-        <w:t>可</w:t>
-      </w:r>
-      <w:proofErr w:type="gramEnd"/>
-      <w:r>
-        <w:t>执行动作。</w:t>
+        <w:t>在确实能先到二、先到三或到达关键技能等级时，提示准确的升级节点和可执行动作。</w:t>
       </w:r>
     </w:p>
     <w:p>
@@ -10432,15 +9494,7 @@
     </w:p>
     <w:p>
       <w:r>
-        <w:t>依据己方视野、敌方公开露头、线上消失、</w:t>
-      </w:r>
-      <w:proofErr w:type="gramStart"/>
-      <w:r>
-        <w:t>兵线位置</w:t>
-      </w:r>
-      <w:proofErr w:type="gramEnd"/>
-      <w:r>
-        <w:t>和队友信号判断风险。</w:t>
+        <w:t>依据己方视野、敌方公开露头、线上消失、兵线位置和队友信号判断风险。</w:t>
       </w:r>
     </w:p>
     <w:p>
@@ -10484,31 +9538,7 @@
     </w:p>
     <w:p>
       <w:r>
-        <w:t>判断推线、控线、</w:t>
-      </w:r>
-      <w:proofErr w:type="gramStart"/>
-      <w:r>
-        <w:t>回推线</w:t>
-      </w:r>
-      <w:proofErr w:type="gramEnd"/>
-      <w:r>
-        <w:t>和回城窗口，提醒玩家避免为空装、</w:t>
-      </w:r>
-      <w:proofErr w:type="gramStart"/>
-      <w:r>
-        <w:t>残血或</w:t>
-      </w:r>
-      <w:proofErr w:type="gramEnd"/>
-      <w:r>
-        <w:t>错误</w:t>
-      </w:r>
-      <w:proofErr w:type="gramStart"/>
-      <w:r>
-        <w:t>兵线状态</w:t>
-      </w:r>
-      <w:proofErr w:type="gramEnd"/>
-      <w:r>
-        <w:t>强行接战。</w:t>
+        <w:t>判断推线、控线、回推线和回城窗口，提醒玩家避免为空装、残血或错误兵线状态强行接战。</w:t>
       </w:r>
     </w:p>
     <w:p>
@@ -10538,35 +9568,7 @@
         <w:rPr>
           <w:rStyle w:val="a4"/>
         </w:rPr>
-        <w:t>闭嘴条件：玩家正在补刀、换血、逃生、连招或</w:t>
-      </w:r>
-      <w:proofErr w:type="gramStart"/>
-      <w:r>
-        <w:rPr>
-          <w:rStyle w:val="a4"/>
-        </w:rPr>
-        <w:t>遭遇团</w:t>
-      </w:r>
-      <w:proofErr w:type="gramEnd"/>
-      <w:r>
-        <w:rPr>
-          <w:rStyle w:val="a4"/>
-        </w:rPr>
-        <w:t>战时，不展示解释性内容；只有明确且紧急的风险才允许使用极短、</w:t>
-      </w:r>
-      <w:proofErr w:type="gramStart"/>
-      <w:r>
-        <w:rPr>
-          <w:rStyle w:val="a4"/>
-        </w:rPr>
-        <w:t>低亮提示</w:t>
-      </w:r>
-      <w:proofErr w:type="gramEnd"/>
-      <w:r>
-        <w:rPr>
-          <w:rStyle w:val="a4"/>
-        </w:rPr>
-        <w:t>。</w:t>
+        <w:t>闭嘴条件：玩家正在补刀、换血、逃生、连招或遭遇团战时，不展示解释性内容；只有明确且紧急的风险才允许使用极短、低亮提示。</w:t>
       </w:r>
     </w:p>
     <w:p>
@@ -10594,12 +9596,10 @@
       </w:r>
     </w:p>
     <w:p>
-      <w:pPr>
+      <w:r>
         <w:rPr>
-          <w:rFonts w:hint="eastAsia"/>
+          <w:noProof/>
         </w:rPr>
-      </w:pPr>
-      <w:r>
         <w:drawing>
           <wp:inline distT="0" distB="0" distL="0" distR="0" wp14:anchorId="14908B95" wp14:editId="5EE0A06C">
             <wp:extent cx="5274310" cy="3774440"/>
@@ -10650,27 +9650,14 @@
       </w:r>
     </w:p>
     <w:p>
-      <w:proofErr w:type="gramStart"/>
-      <w:r>
-        <w:t>根据外塔状态</w:t>
-      </w:r>
-      <w:proofErr w:type="gramEnd"/>
-      <w:r>
-        <w:t>、英雄清线与单挑能力、传送</w:t>
+      <w:r>
+        <w:t>根据外塔状态、英雄清线与单挑能力、传送</w:t>
       </w:r>
       <w:r>
         <w:t>/</w:t>
       </w:r>
       <w:r>
-        <w:t>大招、队友位置、</w:t>
-      </w:r>
-      <w:proofErr w:type="gramStart"/>
-      <w:r>
-        <w:t>兵线和</w:t>
-      </w:r>
-      <w:proofErr w:type="gramEnd"/>
-      <w:r>
-        <w:t>资源时间，建议当前去中路、边线、资源区或回城。</w:t>
+        <w:t>大招、队友位置、兵线和资源时间，建议当前去中路、边线、资源区或回城。</w:t>
       </w:r>
     </w:p>
     <w:p>
@@ -10702,23 +9689,13 @@
           <w:rFonts w:hint="default"/>
         </w:rPr>
       </w:pPr>
-      <w:proofErr w:type="gramStart"/>
       <w:r>
         <w:t>推塔时机</w:t>
       </w:r>
-      <w:proofErr w:type="gramEnd"/>
-    </w:p>
-    <w:p>
-      <w:r>
-        <w:t>根据公开敌方位置、己方人数、兵线、塔血、镀层、召唤师技能和资源时间</w:t>
-      </w:r>
-      <w:proofErr w:type="gramStart"/>
-      <w:r>
-        <w:t>识别推塔机会</w:t>
-      </w:r>
-      <w:proofErr w:type="gramEnd"/>
-      <w:r>
-        <w:t>。</w:t>
+    </w:p>
+    <w:p>
+      <w:r>
+        <w:t>根据公开敌方位置、己方人数、兵线、塔血、镀层、召唤师技能和资源时间识别推塔机会。</w:t>
       </w:r>
     </w:p>
     <w:p>
@@ -10751,13 +9728,8 @@
       </w:r>
     </w:p>
     <w:p>
-      <w:proofErr w:type="gramStart"/>
-      <w:r>
-        <w:t>若人</w:t>
-      </w:r>
-      <w:proofErr w:type="gramEnd"/>
-      <w:r>
-        <w:t>数、视野或时间不足，立即撤销已经失效的提示。</w:t>
+      <w:r>
+        <w:t>若人数、视野或时间不足，立即撤销已经失效的提示。</w:t>
       </w:r>
     </w:p>
     <w:p>
@@ -10895,44 +9867,14 @@
         <w:rPr>
           <w:rStyle w:val="a4"/>
         </w:rPr>
-        <w:t>阶段目标：围绕大龙、远古龙、</w:t>
-      </w:r>
-      <w:proofErr w:type="gramStart"/>
+        <w:t>阶段目标：围绕大龙、远古龙、兵线和复活时间，帮助玩家选择抱团、单带或资源交换，降低一次失误直接结束比赛的风险。</w:t>
+      </w:r>
+    </w:p>
+    <w:p>
       <w:r>
         <w:rPr>
-          <w:rStyle w:val="a4"/>
+          <w:noProof/>
         </w:rPr>
-        <w:t>兵线和</w:t>
-      </w:r>
-      <w:proofErr w:type="gramEnd"/>
-      <w:r>
-        <w:rPr>
-          <w:rStyle w:val="a4"/>
-        </w:rPr>
-        <w:t>复活时间，帮助玩家选择抱团、单带或资源交换，降低一次失误</w:t>
-      </w:r>
-      <w:proofErr w:type="gramStart"/>
-      <w:r>
-        <w:rPr>
-          <w:rStyle w:val="a4"/>
-        </w:rPr>
-        <w:t>直接结束</w:t>
-      </w:r>
-      <w:proofErr w:type="gramEnd"/>
-      <w:r>
-        <w:rPr>
-          <w:rStyle w:val="a4"/>
-        </w:rPr>
-        <w:t>比赛的风险。</w:t>
-      </w:r>
-    </w:p>
-    <w:p>
-      <w:pPr>
-        <w:rPr>
-          <w:rFonts w:hint="eastAsia"/>
-        </w:rPr>
-      </w:pPr>
-      <w:r>
         <w:lastRenderedPageBreak/>
         <w:drawing>
           <wp:inline distT="0" distB="0" distL="0" distR="0" wp14:anchorId="79A41F32" wp14:editId="54F940C0">
@@ -10984,15 +9926,7 @@
     </w:p>
     <w:p>
       <w:r>
-        <w:t>根据双方核心位置、关键技能、资源时间、视野、</w:t>
-      </w:r>
-      <w:proofErr w:type="gramStart"/>
-      <w:r>
-        <w:t>兵线和</w:t>
-      </w:r>
-      <w:proofErr w:type="gramEnd"/>
-      <w:r>
-        <w:t>人数，提示</w:t>
+        <w:t>根据双方核心位置、关键技能、资源时间、视野、兵线和人数，提示</w:t>
       </w:r>
       <w:r>
         <w:t>“</w:t>
@@ -11020,23 +9954,7 @@
     </w:p>
     <w:p>
       <w:r>
-        <w:t>不替玩家决定</w:t>
-      </w:r>
-      <w:proofErr w:type="gramStart"/>
-      <w:r>
-        <w:t>开团对象和最终开团时机</w:t>
-      </w:r>
-      <w:proofErr w:type="gramEnd"/>
-      <w:r>
-        <w:t>，也不</w:t>
-      </w:r>
-      <w:proofErr w:type="gramStart"/>
-      <w:r>
-        <w:t>承诺团战</w:t>
-      </w:r>
-      <w:proofErr w:type="gramEnd"/>
-      <w:r>
-        <w:t>结果。</w:t>
+        <w:t>不替玩家决定开团对象和最终开团时机，也不承诺团战结果。</w:t>
       </w:r>
     </w:p>
     <w:p>
@@ -11238,12 +10156,10 @@
       </w:r>
     </w:p>
     <w:p>
-      <w:pPr>
+      <w:r>
         <w:rPr>
-          <w:rFonts w:hint="eastAsia"/>
+          <w:noProof/>
         </w:rPr>
-      </w:pPr>
-      <w:r>
         <w:drawing>
           <wp:inline distT="0" distB="0" distL="0" distR="0" wp14:anchorId="43694FCC" wp14:editId="5670D534">
             <wp:extent cx="5274310" cy="3649980"/>
@@ -11294,15 +10210,7 @@
     </w:p>
     <w:p>
       <w:r>
-        <w:t>用一句话总结本局</w:t>
-      </w:r>
-      <w:proofErr w:type="gramStart"/>
-      <w:r>
-        <w:t>最</w:t>
-      </w:r>
-      <w:proofErr w:type="gramEnd"/>
-      <w:r>
-        <w:t>关键的可控问题。</w:t>
+        <w:t>用一句话总结本局最关键的可控问题。</w:t>
       </w:r>
     </w:p>
     <w:p>
@@ -11395,13 +10303,7 @@
         <w:t>；可以给出理想构筑，但不评价其他玩家选得好不好。</w:t>
       </w:r>
     </w:p>
-    <w:p>
-      <w:pPr>
-        <w:rPr>
-          <w:rFonts w:hint="eastAsia"/>
-        </w:rPr>
-      </w:pPr>
-    </w:p>
+    <w:p/>
     <w:p>
       <w:pPr>
         <w:pStyle w:val="3"/>
@@ -11453,12 +10355,10 @@
       </w:r>
     </w:p>
     <w:p>
-      <w:pPr>
+      <w:r>
         <w:rPr>
-          <w:rFonts w:hint="eastAsia"/>
+          <w:noProof/>
         </w:rPr>
-      </w:pPr>
-      <w:r>
         <w:drawing>
           <wp:inline distT="0" distB="0" distL="0" distR="0" wp14:anchorId="08220E04" wp14:editId="664BC94A">
             <wp:extent cx="5274310" cy="4330700"/>
@@ -11519,23 +10419,7 @@
     </w:p>
     <w:p>
       <w:r>
-        <w:t>中后期：是否根据阵容强势</w:t>
-      </w:r>
-      <w:proofErr w:type="gramStart"/>
-      <w:r>
-        <w:t>期选择</w:t>
-      </w:r>
-      <w:proofErr w:type="gramEnd"/>
-      <w:r>
-        <w:t>抱团、单带、</w:t>
-      </w:r>
-      <w:proofErr w:type="gramStart"/>
-      <w:r>
-        <w:t>逼资源</w:t>
-      </w:r>
-      <w:proofErr w:type="gramEnd"/>
-      <w:r>
-        <w:t>或换塔。</w:t>
+        <w:t>中后期：是否根据阵容强势期选择抱团、单带、逼资源或换塔。</w:t>
       </w:r>
     </w:p>
     <w:p>
@@ -11557,15 +10441,7 @@
     </w:p>
     <w:p>
       <w:r>
-        <w:t>提供金币、补刀、经验曲线，装备购买与技能加点时间线，</w:t>
-      </w:r>
-      <w:proofErr w:type="gramStart"/>
-      <w:r>
-        <w:t>符文实际</w:t>
-      </w:r>
-      <w:proofErr w:type="gramEnd"/>
-      <w:r>
-        <w:t>收益和关键事件地图。</w:t>
+        <w:t>提供金币、补刀、经验曲线，装备购买与技能加点时间线，符文实际收益和关键事件地图。</w:t>
       </w:r>
     </w:p>
     <w:p>
@@ -11640,13 +10516,2651 @@
         <w:t>跟踪单局训练目标的完成情况；当一个问题稳定改善后，再切换到下一项能力。</w:t>
       </w:r>
     </w:p>
-    <w:p/>
+    <w:p>
+      <w:pPr>
+        <w:pStyle w:val="1"/>
+        <w:rPr>
+          <w:rFonts w:cs="宋体"/>
+          <w:kern w:val="36"/>
+          <w:sz w:val="48"/>
+        </w:rPr>
+      </w:pPr>
+      <w:r>
+        <w:t>上线时机</w:t>
+      </w:r>
+    </w:p>
+    <w:tbl>
+      <w:tblPr>
+        <w:tblW w:w="0" w:type="auto"/>
+        <w:tblCellMar>
+          <w:top w:w="15" w:type="dxa"/>
+          <w:left w:w="15" w:type="dxa"/>
+          <w:bottom w:w="15" w:type="dxa"/>
+          <w:right w:w="15" w:type="dxa"/>
+        </w:tblCellMar>
+        <w:tblLook w:val="04A0" w:firstRow="1" w:lastRow="0" w:firstColumn="1" w:lastColumn="0" w:noHBand="0" w:noVBand="1"/>
+      </w:tblPr>
+      <w:tblGrid>
+        <w:gridCol w:w="736"/>
+        <w:gridCol w:w="289"/>
+        <w:gridCol w:w="1809"/>
+        <w:gridCol w:w="1743"/>
+        <w:gridCol w:w="3759"/>
+      </w:tblGrid>
+      <w:tr>
+        <w:trPr>
+          <w:trHeight w:val="405"/>
+        </w:trPr>
+        <w:tc>
+          <w:tcPr>
+            <w:tcW w:w="0" w:type="auto"/>
+            <w:tcBorders>
+              <w:top w:val="single" w:sz="4" w:space="0" w:color="DEE0E3"/>
+              <w:left w:val="single" w:sz="4" w:space="0" w:color="DEE0E3"/>
+              <w:bottom w:val="single" w:sz="4" w:space="0" w:color="DEE0E3"/>
+              <w:right w:val="single" w:sz="4" w:space="0" w:color="DEE0E3"/>
+            </w:tcBorders>
+            <w:noWrap/>
+            <w:vAlign w:val="center"/>
+            <w:hideMark/>
+          </w:tcPr>
+          <w:p>
+            <w:pPr>
+              <w:jc w:val="center"/>
+              <w:rPr>
+                <w:b/>
+                <w:bCs/>
+                <w:sz w:val="20"/>
+                <w:szCs w:val="20"/>
+              </w:rPr>
+            </w:pPr>
+            <w:r>
+              <w:rPr>
+                <w:b/>
+                <w:bCs/>
+                <w:sz w:val="20"/>
+                <w:szCs w:val="20"/>
+              </w:rPr>
+              <w:t>阶段</w:t>
+            </w:r>
+          </w:p>
+        </w:tc>
+        <w:tc>
+          <w:tcPr>
+            <w:tcW w:w="0" w:type="auto"/>
+            <w:tcBorders>
+              <w:top w:val="single" w:sz="4" w:space="0" w:color="DEE0E3"/>
+              <w:left w:val="single" w:sz="4" w:space="0" w:color="DEE0E3"/>
+              <w:bottom w:val="single" w:sz="4" w:space="0" w:color="DEE0E3"/>
+              <w:right w:val="single" w:sz="4" w:space="0" w:color="DEE0E3"/>
+            </w:tcBorders>
+            <w:noWrap/>
+            <w:vAlign w:val="center"/>
+            <w:hideMark/>
+          </w:tcPr>
+          <w:p>
+            <w:pPr>
+              <w:jc w:val="center"/>
+              <w:rPr>
+                <w:b/>
+                <w:bCs/>
+                <w:sz w:val="20"/>
+                <w:szCs w:val="20"/>
+              </w:rPr>
+            </w:pPr>
+            <w:r>
+              <w:rPr>
+                <w:b/>
+                <w:bCs/>
+                <w:sz w:val="20"/>
+                <w:szCs w:val="20"/>
+              </w:rPr>
+              <w:t>周期</w:t>
+            </w:r>
+          </w:p>
+        </w:tc>
+        <w:tc>
+          <w:tcPr>
+            <w:tcW w:w="0" w:type="auto"/>
+            <w:tcBorders>
+              <w:top w:val="single" w:sz="4" w:space="0" w:color="DEE0E3"/>
+              <w:left w:val="single" w:sz="4" w:space="0" w:color="DEE0E3"/>
+              <w:bottom w:val="single" w:sz="4" w:space="0" w:color="DEE0E3"/>
+              <w:right w:val="single" w:sz="4" w:space="0" w:color="DEE0E3"/>
+            </w:tcBorders>
+            <w:noWrap/>
+            <w:vAlign w:val="center"/>
+            <w:hideMark/>
+          </w:tcPr>
+          <w:p>
+            <w:pPr>
+              <w:jc w:val="center"/>
+              <w:rPr>
+                <w:b/>
+                <w:bCs/>
+                <w:sz w:val="20"/>
+                <w:szCs w:val="20"/>
+              </w:rPr>
+            </w:pPr>
+            <w:r>
+              <w:rPr>
+                <w:b/>
+                <w:bCs/>
+                <w:sz w:val="20"/>
+                <w:szCs w:val="20"/>
+              </w:rPr>
+              <w:t>开放范围</w:t>
+            </w:r>
+          </w:p>
+        </w:tc>
+        <w:tc>
+          <w:tcPr>
+            <w:tcW w:w="0" w:type="auto"/>
+            <w:tcBorders>
+              <w:top w:val="single" w:sz="4" w:space="0" w:color="DEE0E3"/>
+              <w:left w:val="single" w:sz="4" w:space="0" w:color="DEE0E3"/>
+              <w:bottom w:val="single" w:sz="4" w:space="0" w:color="DEE0E3"/>
+              <w:right w:val="single" w:sz="4" w:space="0" w:color="DEE0E3"/>
+            </w:tcBorders>
+            <w:noWrap/>
+            <w:vAlign w:val="center"/>
+            <w:hideMark/>
+          </w:tcPr>
+          <w:p>
+            <w:pPr>
+              <w:jc w:val="center"/>
+              <w:rPr>
+                <w:b/>
+                <w:bCs/>
+                <w:sz w:val="20"/>
+                <w:szCs w:val="20"/>
+              </w:rPr>
+            </w:pPr>
+            <w:r>
+              <w:rPr>
+                <w:b/>
+                <w:bCs/>
+                <w:sz w:val="20"/>
+                <w:szCs w:val="20"/>
+              </w:rPr>
+              <w:t>主要能力</w:t>
+            </w:r>
+          </w:p>
+        </w:tc>
+        <w:tc>
+          <w:tcPr>
+            <w:tcW w:w="0" w:type="auto"/>
+            <w:tcBorders>
+              <w:top w:val="single" w:sz="4" w:space="0" w:color="DEE0E3"/>
+              <w:left w:val="single" w:sz="4" w:space="0" w:color="DEE0E3"/>
+              <w:bottom w:val="single" w:sz="4" w:space="0" w:color="DEE0E3"/>
+              <w:right w:val="single" w:sz="4" w:space="0" w:color="DEE0E3"/>
+            </w:tcBorders>
+            <w:noWrap/>
+            <w:vAlign w:val="center"/>
+            <w:hideMark/>
+          </w:tcPr>
+          <w:p>
+            <w:pPr>
+              <w:jc w:val="center"/>
+              <w:rPr>
+                <w:b/>
+                <w:bCs/>
+                <w:sz w:val="20"/>
+                <w:szCs w:val="20"/>
+              </w:rPr>
+            </w:pPr>
+            <w:r>
+              <w:rPr>
+                <w:b/>
+                <w:bCs/>
+                <w:sz w:val="20"/>
+                <w:szCs w:val="20"/>
+              </w:rPr>
+              <w:t>核心目标</w:t>
+            </w:r>
+          </w:p>
+        </w:tc>
+      </w:tr>
+      <w:tr>
+        <w:trPr>
+          <w:trHeight w:val="690"/>
+        </w:trPr>
+        <w:tc>
+          <w:tcPr>
+            <w:tcW w:w="0" w:type="auto"/>
+            <w:tcBorders>
+              <w:top w:val="single" w:sz="4" w:space="0" w:color="DEE0E3"/>
+              <w:left w:val="single" w:sz="4" w:space="0" w:color="DEE0E3"/>
+              <w:bottom w:val="single" w:sz="4" w:space="0" w:color="DEE0E3"/>
+              <w:right w:val="single" w:sz="4" w:space="0" w:color="DEE0E3"/>
+            </w:tcBorders>
+            <w:noWrap/>
+            <w:vAlign w:val="center"/>
+            <w:hideMark/>
+          </w:tcPr>
+          <w:p>
+            <w:pPr>
+              <w:jc w:val="center"/>
+              <w:rPr>
+                <w:sz w:val="20"/>
+                <w:szCs w:val="20"/>
+              </w:rPr>
+            </w:pPr>
+            <w:r>
+              <w:rPr>
+                <w:sz w:val="20"/>
+                <w:szCs w:val="20"/>
+              </w:rPr>
+              <w:t>内测</w:t>
+            </w:r>
+          </w:p>
+        </w:tc>
+        <w:tc>
+          <w:tcPr>
+            <w:tcW w:w="0" w:type="auto"/>
+            <w:tcBorders>
+              <w:top w:val="single" w:sz="4" w:space="0" w:color="DEE0E3"/>
+              <w:left w:val="single" w:sz="4" w:space="0" w:color="DEE0E3"/>
+              <w:bottom w:val="single" w:sz="4" w:space="0" w:color="DEE0E3"/>
+              <w:right w:val="single" w:sz="4" w:space="0" w:color="DEE0E3"/>
+            </w:tcBorders>
+            <w:noWrap/>
+            <w:vAlign w:val="center"/>
+            <w:hideMark/>
+          </w:tcPr>
+          <w:p>
+            <w:pPr>
+              <w:jc w:val="center"/>
+              <w:rPr>
+                <w:sz w:val="20"/>
+                <w:szCs w:val="20"/>
+              </w:rPr>
+            </w:pPr>
+            <w:r>
+              <w:rPr>
+                <w:sz w:val="20"/>
+                <w:szCs w:val="20"/>
+              </w:rPr>
+              <w:t>1</w:t>
+            </w:r>
+            <w:r>
+              <w:rPr>
+                <w:sz w:val="20"/>
+                <w:szCs w:val="20"/>
+              </w:rPr>
+              <w:t>周</w:t>
+            </w:r>
+          </w:p>
+        </w:tc>
+        <w:tc>
+          <w:tcPr>
+            <w:tcW w:w="0" w:type="auto"/>
+            <w:tcBorders>
+              <w:top w:val="single" w:sz="4" w:space="0" w:color="DEE0E3"/>
+              <w:left w:val="single" w:sz="4" w:space="0" w:color="DEE0E3"/>
+              <w:bottom w:val="single" w:sz="4" w:space="0" w:color="DEE0E3"/>
+              <w:right w:val="single" w:sz="4" w:space="0" w:color="DEE0E3"/>
+            </w:tcBorders>
+            <w:noWrap/>
+            <w:vAlign w:val="center"/>
+            <w:hideMark/>
+          </w:tcPr>
+          <w:p>
+            <w:pPr>
+              <w:jc w:val="center"/>
+              <w:rPr>
+                <w:sz w:val="20"/>
+                <w:szCs w:val="20"/>
+              </w:rPr>
+            </w:pPr>
+            <w:r>
+              <w:rPr>
+                <w:sz w:val="20"/>
+                <w:szCs w:val="20"/>
+              </w:rPr>
+              <w:t>员工、测试账号、白名单玩家</w:t>
+            </w:r>
+          </w:p>
+        </w:tc>
+        <w:tc>
+          <w:tcPr>
+            <w:tcW w:w="0" w:type="auto"/>
+            <w:tcBorders>
+              <w:top w:val="single" w:sz="4" w:space="0" w:color="DEE0E3"/>
+              <w:left w:val="single" w:sz="4" w:space="0" w:color="DEE0E3"/>
+              <w:bottom w:val="single" w:sz="4" w:space="0" w:color="DEE0E3"/>
+              <w:right w:val="single" w:sz="4" w:space="0" w:color="DEE0E3"/>
+            </w:tcBorders>
+            <w:noWrap/>
+            <w:vAlign w:val="center"/>
+            <w:hideMark/>
+          </w:tcPr>
+          <w:p>
+            <w:pPr>
+              <w:jc w:val="center"/>
+              <w:rPr>
+                <w:sz w:val="20"/>
+                <w:szCs w:val="20"/>
+              </w:rPr>
+            </w:pPr>
+            <w:r>
+              <w:rPr>
+                <w:sz w:val="20"/>
+                <w:szCs w:val="20"/>
+              </w:rPr>
+              <w:t>对局前推荐、赛后复盘、模拟局内提示</w:t>
+            </w:r>
+          </w:p>
+        </w:tc>
+        <w:tc>
+          <w:tcPr>
+            <w:tcW w:w="0" w:type="auto"/>
+            <w:tcBorders>
+              <w:top w:val="single" w:sz="4" w:space="0" w:color="DEE0E3"/>
+              <w:left w:val="single" w:sz="4" w:space="0" w:color="DEE0E3"/>
+              <w:bottom w:val="single" w:sz="4" w:space="0" w:color="DEE0E3"/>
+              <w:right w:val="single" w:sz="4" w:space="0" w:color="DEE0E3"/>
+            </w:tcBorders>
+            <w:noWrap/>
+            <w:vAlign w:val="center"/>
+            <w:hideMark/>
+          </w:tcPr>
+          <w:p>
+            <w:pPr>
+              <w:jc w:val="center"/>
+              <w:rPr>
+                <w:sz w:val="20"/>
+                <w:szCs w:val="20"/>
+              </w:rPr>
+            </w:pPr>
+            <w:r>
+              <w:rPr>
+                <w:sz w:val="20"/>
+                <w:szCs w:val="20"/>
+              </w:rPr>
+              <w:t>验证版本数据、规则、触发逻辑、性能和合规边界</w:t>
+            </w:r>
+          </w:p>
+        </w:tc>
+      </w:tr>
+      <w:tr>
+        <w:trPr>
+          <w:trHeight w:val="975"/>
+        </w:trPr>
+        <w:tc>
+          <w:tcPr>
+            <w:tcW w:w="0" w:type="auto"/>
+            <w:tcBorders>
+              <w:top w:val="single" w:sz="4" w:space="0" w:color="DEE0E3"/>
+              <w:left w:val="single" w:sz="4" w:space="0" w:color="DEE0E3"/>
+              <w:bottom w:val="single" w:sz="4" w:space="0" w:color="DEE0E3"/>
+              <w:right w:val="single" w:sz="4" w:space="0" w:color="DEE0E3"/>
+            </w:tcBorders>
+            <w:noWrap/>
+            <w:vAlign w:val="center"/>
+            <w:hideMark/>
+          </w:tcPr>
+          <w:p>
+            <w:pPr>
+              <w:jc w:val="center"/>
+              <w:rPr>
+                <w:sz w:val="20"/>
+                <w:szCs w:val="20"/>
+              </w:rPr>
+            </w:pPr>
+            <w:r>
+              <w:rPr>
+                <w:sz w:val="20"/>
+                <w:szCs w:val="20"/>
+              </w:rPr>
+              <w:t>小范围灰度测试</w:t>
+            </w:r>
+          </w:p>
+        </w:tc>
+        <w:tc>
+          <w:tcPr>
+            <w:tcW w:w="0" w:type="auto"/>
+            <w:tcBorders>
+              <w:top w:val="single" w:sz="4" w:space="0" w:color="DEE0E3"/>
+              <w:left w:val="single" w:sz="4" w:space="0" w:color="DEE0E3"/>
+              <w:bottom w:val="single" w:sz="4" w:space="0" w:color="DEE0E3"/>
+              <w:right w:val="single" w:sz="4" w:space="0" w:color="DEE0E3"/>
+            </w:tcBorders>
+            <w:noWrap/>
+            <w:vAlign w:val="center"/>
+            <w:hideMark/>
+          </w:tcPr>
+          <w:p>
+            <w:pPr>
+              <w:jc w:val="center"/>
+              <w:rPr>
+                <w:sz w:val="20"/>
+                <w:szCs w:val="20"/>
+              </w:rPr>
+            </w:pPr>
+            <w:r>
+              <w:rPr>
+                <w:sz w:val="20"/>
+                <w:szCs w:val="20"/>
+              </w:rPr>
+              <w:t>1</w:t>
+            </w:r>
+            <w:r>
+              <w:rPr>
+                <w:sz w:val="20"/>
+                <w:szCs w:val="20"/>
+              </w:rPr>
+              <w:t>周</w:t>
+            </w:r>
+          </w:p>
+        </w:tc>
+        <w:tc>
+          <w:tcPr>
+            <w:tcW w:w="0" w:type="auto"/>
+            <w:tcBorders>
+              <w:top w:val="single" w:sz="4" w:space="0" w:color="DEE0E3"/>
+              <w:left w:val="single" w:sz="4" w:space="0" w:color="DEE0E3"/>
+              <w:bottom w:val="single" w:sz="4" w:space="0" w:color="DEE0E3"/>
+              <w:right w:val="single" w:sz="4" w:space="0" w:color="DEE0E3"/>
+            </w:tcBorders>
+            <w:noWrap/>
+            <w:vAlign w:val="center"/>
+            <w:hideMark/>
+          </w:tcPr>
+          <w:p>
+            <w:pPr>
+              <w:jc w:val="center"/>
+              <w:rPr>
+                <w:sz w:val="20"/>
+                <w:szCs w:val="20"/>
+              </w:rPr>
+            </w:pPr>
+            <w:r>
+              <w:rPr>
+                <w:sz w:val="20"/>
+                <w:szCs w:val="20"/>
+              </w:rPr>
+              <w:t xml:space="preserve">20%-30% </w:t>
+            </w:r>
+            <w:r>
+              <w:rPr>
+                <w:sz w:val="20"/>
+                <w:szCs w:val="20"/>
+              </w:rPr>
+              <w:t>符合条件的普通活跃</w:t>
+            </w:r>
+            <w:r>
+              <w:rPr>
+                <w:sz w:val="20"/>
+                <w:szCs w:val="20"/>
+              </w:rPr>
+              <w:t>/</w:t>
+            </w:r>
+            <w:r>
+              <w:rPr>
+                <w:sz w:val="20"/>
+                <w:szCs w:val="20"/>
+              </w:rPr>
+              <w:t>回流玩家</w:t>
+            </w:r>
+          </w:p>
+        </w:tc>
+        <w:tc>
+          <w:tcPr>
+            <w:tcW w:w="0" w:type="auto"/>
+            <w:tcBorders>
+              <w:top w:val="single" w:sz="4" w:space="0" w:color="DEE0E3"/>
+              <w:left w:val="single" w:sz="4" w:space="0" w:color="DEE0E3"/>
+              <w:bottom w:val="single" w:sz="4" w:space="0" w:color="DEE0E3"/>
+              <w:right w:val="single" w:sz="4" w:space="0" w:color="DEE0E3"/>
+            </w:tcBorders>
+            <w:noWrap/>
+            <w:vAlign w:val="center"/>
+            <w:hideMark/>
+          </w:tcPr>
+          <w:p>
+            <w:pPr>
+              <w:jc w:val="center"/>
+              <w:rPr>
+                <w:sz w:val="20"/>
+                <w:szCs w:val="20"/>
+              </w:rPr>
+            </w:pPr>
+            <w:r>
+              <w:rPr>
+                <w:sz w:val="20"/>
+                <w:szCs w:val="20"/>
+              </w:rPr>
+              <w:t>对局前推荐</w:t>
+            </w:r>
+            <w:r>
+              <w:rPr>
+                <w:sz w:val="20"/>
+                <w:szCs w:val="20"/>
+              </w:rPr>
+              <w:t xml:space="preserve"> + </w:t>
+            </w:r>
+            <w:r>
+              <w:rPr>
+                <w:sz w:val="20"/>
+                <w:szCs w:val="20"/>
+              </w:rPr>
+              <w:t>赛后复盘</w:t>
+            </w:r>
+          </w:p>
+        </w:tc>
+        <w:tc>
+          <w:tcPr>
+            <w:tcW w:w="0" w:type="auto"/>
+            <w:tcBorders>
+              <w:top w:val="single" w:sz="4" w:space="0" w:color="DEE0E3"/>
+              <w:left w:val="single" w:sz="4" w:space="0" w:color="DEE0E3"/>
+              <w:bottom w:val="single" w:sz="4" w:space="0" w:color="DEE0E3"/>
+              <w:right w:val="single" w:sz="4" w:space="0" w:color="DEE0E3"/>
+            </w:tcBorders>
+            <w:noWrap/>
+            <w:vAlign w:val="center"/>
+            <w:hideMark/>
+          </w:tcPr>
+          <w:p>
+            <w:pPr>
+              <w:jc w:val="center"/>
+              <w:rPr>
+                <w:sz w:val="20"/>
+                <w:szCs w:val="20"/>
+              </w:rPr>
+            </w:pPr>
+            <w:r>
+              <w:rPr>
+                <w:sz w:val="20"/>
+                <w:szCs w:val="20"/>
+              </w:rPr>
+              <w:t>验证用户是否使用、是否复用、是否改善行为，验证千人千面是否真的优于统一推荐</w:t>
+            </w:r>
+          </w:p>
+        </w:tc>
+      </w:tr>
+      <w:tr>
+        <w:trPr>
+          <w:trHeight w:val="690"/>
+        </w:trPr>
+        <w:tc>
+          <w:tcPr>
+            <w:tcW w:w="0" w:type="auto"/>
+            <w:tcBorders>
+              <w:top w:val="single" w:sz="4" w:space="0" w:color="DEE0E3"/>
+              <w:left w:val="single" w:sz="4" w:space="0" w:color="DEE0E3"/>
+              <w:bottom w:val="single" w:sz="4" w:space="0" w:color="DEE0E3"/>
+              <w:right w:val="single" w:sz="4" w:space="0" w:color="DEE0E3"/>
+            </w:tcBorders>
+            <w:noWrap/>
+            <w:vAlign w:val="center"/>
+            <w:hideMark/>
+          </w:tcPr>
+          <w:p>
+            <w:pPr>
+              <w:jc w:val="center"/>
+              <w:rPr>
+                <w:sz w:val="20"/>
+                <w:szCs w:val="20"/>
+              </w:rPr>
+            </w:pPr>
+            <w:r>
+              <w:rPr>
+                <w:sz w:val="20"/>
+                <w:szCs w:val="20"/>
+              </w:rPr>
+              <w:t>局内提示测试</w:t>
+            </w:r>
+          </w:p>
+        </w:tc>
+        <w:tc>
+          <w:tcPr>
+            <w:tcW w:w="0" w:type="auto"/>
+            <w:tcBorders>
+              <w:top w:val="single" w:sz="4" w:space="0" w:color="DEE0E3"/>
+              <w:left w:val="single" w:sz="4" w:space="0" w:color="DEE0E3"/>
+              <w:bottom w:val="single" w:sz="4" w:space="0" w:color="DEE0E3"/>
+              <w:right w:val="single" w:sz="4" w:space="0" w:color="DEE0E3"/>
+            </w:tcBorders>
+            <w:noWrap/>
+            <w:vAlign w:val="center"/>
+            <w:hideMark/>
+          </w:tcPr>
+          <w:p>
+            <w:pPr>
+              <w:jc w:val="center"/>
+              <w:rPr>
+                <w:sz w:val="20"/>
+                <w:szCs w:val="20"/>
+              </w:rPr>
+            </w:pPr>
+            <w:r>
+              <w:rPr>
+                <w:sz w:val="20"/>
+                <w:szCs w:val="20"/>
+              </w:rPr>
+              <w:t>1-2</w:t>
+            </w:r>
+            <w:r>
+              <w:rPr>
+                <w:sz w:val="20"/>
+                <w:szCs w:val="20"/>
+              </w:rPr>
+              <w:t>周</w:t>
+            </w:r>
+          </w:p>
+        </w:tc>
+        <w:tc>
+          <w:tcPr>
+            <w:tcW w:w="0" w:type="auto"/>
+            <w:tcBorders>
+              <w:top w:val="single" w:sz="4" w:space="0" w:color="DEE0E3"/>
+              <w:left w:val="single" w:sz="4" w:space="0" w:color="DEE0E3"/>
+              <w:bottom w:val="single" w:sz="4" w:space="0" w:color="DEE0E3"/>
+              <w:right w:val="single" w:sz="4" w:space="0" w:color="DEE0E3"/>
+            </w:tcBorders>
+            <w:noWrap/>
+            <w:vAlign w:val="center"/>
+            <w:hideMark/>
+          </w:tcPr>
+          <w:p>
+            <w:pPr>
+              <w:jc w:val="center"/>
+              <w:rPr>
+                <w:sz w:val="20"/>
+                <w:szCs w:val="20"/>
+              </w:rPr>
+            </w:pPr>
+            <w:r>
+              <w:rPr>
+                <w:sz w:val="20"/>
+                <w:szCs w:val="20"/>
+              </w:rPr>
+              <w:t>30%-50%</w:t>
+            </w:r>
+            <w:r>
+              <w:rPr>
+                <w:sz w:val="20"/>
+                <w:szCs w:val="20"/>
+              </w:rPr>
+              <w:t>，仅主动开启用户</w:t>
+            </w:r>
+          </w:p>
+        </w:tc>
+        <w:tc>
+          <w:tcPr>
+            <w:tcW w:w="0" w:type="auto"/>
+            <w:tcBorders>
+              <w:top w:val="single" w:sz="4" w:space="0" w:color="DEE0E3"/>
+              <w:left w:val="single" w:sz="4" w:space="0" w:color="DEE0E3"/>
+              <w:bottom w:val="single" w:sz="4" w:space="0" w:color="DEE0E3"/>
+              <w:right w:val="single" w:sz="4" w:space="0" w:color="DEE0E3"/>
+            </w:tcBorders>
+            <w:noWrap/>
+            <w:vAlign w:val="center"/>
+            <w:hideMark/>
+          </w:tcPr>
+          <w:p>
+            <w:pPr>
+              <w:jc w:val="center"/>
+              <w:rPr>
+                <w:sz w:val="20"/>
+                <w:szCs w:val="20"/>
+              </w:rPr>
+            </w:pPr>
+            <w:r>
+              <w:rPr>
+                <w:sz w:val="20"/>
+                <w:szCs w:val="20"/>
+              </w:rPr>
+              <w:t>高置信度、低频、非战斗期局内提醒</w:t>
+            </w:r>
+          </w:p>
+        </w:tc>
+        <w:tc>
+          <w:tcPr>
+            <w:tcW w:w="0" w:type="auto"/>
+            <w:tcBorders>
+              <w:top w:val="single" w:sz="4" w:space="0" w:color="DEE0E3"/>
+              <w:left w:val="single" w:sz="4" w:space="0" w:color="DEE0E3"/>
+              <w:bottom w:val="single" w:sz="4" w:space="0" w:color="DEE0E3"/>
+              <w:right w:val="single" w:sz="4" w:space="0" w:color="DEE0E3"/>
+            </w:tcBorders>
+            <w:noWrap/>
+            <w:vAlign w:val="center"/>
+            <w:hideMark/>
+          </w:tcPr>
+          <w:p>
+            <w:pPr>
+              <w:jc w:val="center"/>
+              <w:rPr>
+                <w:sz w:val="20"/>
+                <w:szCs w:val="20"/>
+              </w:rPr>
+            </w:pPr>
+            <w:r>
+              <w:rPr>
+                <w:sz w:val="20"/>
+                <w:szCs w:val="20"/>
+              </w:rPr>
+              <w:t>验证局内提示是否有帮助且不干扰</w:t>
+            </w:r>
+          </w:p>
+        </w:tc>
+      </w:tr>
+      <w:tr>
+        <w:trPr>
+          <w:trHeight w:val="405"/>
+        </w:trPr>
+        <w:tc>
+          <w:tcPr>
+            <w:tcW w:w="0" w:type="auto"/>
+            <w:tcBorders>
+              <w:top w:val="single" w:sz="4" w:space="0" w:color="DEE0E3"/>
+              <w:left w:val="single" w:sz="4" w:space="0" w:color="DEE0E3"/>
+              <w:bottom w:val="single" w:sz="4" w:space="0" w:color="DEE0E3"/>
+              <w:right w:val="single" w:sz="4" w:space="0" w:color="DEE0E3"/>
+            </w:tcBorders>
+            <w:noWrap/>
+            <w:vAlign w:val="center"/>
+            <w:hideMark/>
+          </w:tcPr>
+          <w:p>
+            <w:pPr>
+              <w:jc w:val="center"/>
+              <w:rPr>
+                <w:sz w:val="20"/>
+                <w:szCs w:val="20"/>
+              </w:rPr>
+            </w:pPr>
+            <w:r>
+              <w:rPr>
+                <w:sz w:val="20"/>
+                <w:szCs w:val="20"/>
+              </w:rPr>
+              <w:t>全量开放</w:t>
+            </w:r>
+          </w:p>
+        </w:tc>
+        <w:tc>
+          <w:tcPr>
+            <w:tcW w:w="0" w:type="auto"/>
+            <w:tcBorders>
+              <w:top w:val="single" w:sz="4" w:space="0" w:color="DEE0E3"/>
+              <w:left w:val="single" w:sz="4" w:space="0" w:color="DEE0E3"/>
+              <w:bottom w:val="single" w:sz="4" w:space="0" w:color="DEE0E3"/>
+              <w:right w:val="single" w:sz="4" w:space="0" w:color="DEE0E3"/>
+            </w:tcBorders>
+            <w:noWrap/>
+            <w:vAlign w:val="center"/>
+            <w:hideMark/>
+          </w:tcPr>
+          <w:p>
+            <w:pPr>
+              <w:jc w:val="center"/>
+              <w:rPr>
+                <w:sz w:val="20"/>
+                <w:szCs w:val="20"/>
+              </w:rPr>
+            </w:pPr>
+            <w:r>
+              <w:rPr>
+                <w:sz w:val="20"/>
+                <w:szCs w:val="20"/>
+              </w:rPr>
+              <w:t>持续</w:t>
+            </w:r>
+          </w:p>
+        </w:tc>
+        <w:tc>
+          <w:tcPr>
+            <w:tcW w:w="0" w:type="auto"/>
+            <w:tcBorders>
+              <w:top w:val="single" w:sz="4" w:space="0" w:color="DEE0E3"/>
+              <w:left w:val="single" w:sz="4" w:space="0" w:color="DEE0E3"/>
+              <w:bottom w:val="single" w:sz="4" w:space="0" w:color="DEE0E3"/>
+              <w:right w:val="single" w:sz="4" w:space="0" w:color="DEE0E3"/>
+            </w:tcBorders>
+            <w:noWrap/>
+            <w:vAlign w:val="center"/>
+            <w:hideMark/>
+          </w:tcPr>
+          <w:p>
+            <w:pPr>
+              <w:jc w:val="center"/>
+              <w:rPr>
+                <w:sz w:val="20"/>
+                <w:szCs w:val="20"/>
+              </w:rPr>
+            </w:pPr>
+            <w:r>
+              <w:rPr>
+                <w:sz w:val="20"/>
+                <w:szCs w:val="20"/>
+              </w:rPr>
+              <w:t xml:space="preserve">100% </w:t>
+            </w:r>
+            <w:r>
+              <w:rPr>
+                <w:sz w:val="20"/>
+                <w:szCs w:val="20"/>
+              </w:rPr>
+              <w:t>符合资格用户</w:t>
+            </w:r>
+          </w:p>
+        </w:tc>
+        <w:tc>
+          <w:tcPr>
+            <w:tcW w:w="0" w:type="auto"/>
+            <w:tcBorders>
+              <w:top w:val="single" w:sz="4" w:space="0" w:color="DEE0E3"/>
+              <w:left w:val="single" w:sz="4" w:space="0" w:color="DEE0E3"/>
+              <w:bottom w:val="single" w:sz="4" w:space="0" w:color="DEE0E3"/>
+              <w:right w:val="single" w:sz="4" w:space="0" w:color="DEE0E3"/>
+            </w:tcBorders>
+            <w:noWrap/>
+            <w:vAlign w:val="center"/>
+            <w:hideMark/>
+          </w:tcPr>
+          <w:p>
+            <w:pPr>
+              <w:jc w:val="center"/>
+              <w:rPr>
+                <w:sz w:val="20"/>
+                <w:szCs w:val="20"/>
+              </w:rPr>
+            </w:pPr>
+            <w:r>
+              <w:rPr>
+                <w:sz w:val="20"/>
+                <w:szCs w:val="20"/>
+              </w:rPr>
+              <w:t>全能力可用，按画像个性化配置</w:t>
+            </w:r>
+          </w:p>
+        </w:tc>
+        <w:tc>
+          <w:tcPr>
+            <w:tcW w:w="0" w:type="auto"/>
+            <w:tcBorders>
+              <w:top w:val="single" w:sz="4" w:space="0" w:color="DEE0E3"/>
+              <w:left w:val="single" w:sz="4" w:space="0" w:color="DEE0E3"/>
+              <w:bottom w:val="single" w:sz="4" w:space="0" w:color="DEE0E3"/>
+              <w:right w:val="single" w:sz="4" w:space="0" w:color="DEE0E3"/>
+            </w:tcBorders>
+            <w:noWrap/>
+            <w:vAlign w:val="center"/>
+            <w:hideMark/>
+          </w:tcPr>
+          <w:p>
+            <w:pPr>
+              <w:jc w:val="center"/>
+              <w:rPr>
+                <w:sz w:val="20"/>
+                <w:szCs w:val="20"/>
+              </w:rPr>
+            </w:pPr>
+            <w:r>
+              <w:rPr>
+                <w:sz w:val="20"/>
+                <w:szCs w:val="20"/>
+              </w:rPr>
+              <w:t>稳定运营、长期留存和能力迭代</w:t>
+            </w:r>
+          </w:p>
+        </w:tc>
+      </w:tr>
+    </w:tbl>
+    <w:p>
+      <w:pPr>
+        <w:pStyle w:val="1"/>
+        <w:rPr>
+          <w:sz w:val="48"/>
+        </w:rPr>
+      </w:pPr>
+      <w:r>
+        <w:t>核心指标卡</w:t>
+      </w:r>
+    </w:p>
+    <w:tbl>
+      <w:tblPr>
+        <w:tblW w:w="0" w:type="auto"/>
+        <w:tblCellMar>
+          <w:top w:w="15" w:type="dxa"/>
+          <w:left w:w="15" w:type="dxa"/>
+          <w:bottom w:w="15" w:type="dxa"/>
+          <w:right w:w="15" w:type="dxa"/>
+        </w:tblCellMar>
+        <w:tblLook w:val="04A0" w:firstRow="1" w:lastRow="0" w:firstColumn="1" w:lastColumn="0" w:noHBand="0" w:noVBand="1"/>
+      </w:tblPr>
+      <w:tblGrid>
+        <w:gridCol w:w="453"/>
+        <w:gridCol w:w="2574"/>
+        <w:gridCol w:w="3150"/>
+        <w:gridCol w:w="2159"/>
+      </w:tblGrid>
+      <w:tr>
+        <w:trPr>
+          <w:trHeight w:val="405"/>
+        </w:trPr>
+        <w:tc>
+          <w:tcPr>
+            <w:tcW w:w="0" w:type="auto"/>
+            <w:tcBorders>
+              <w:top w:val="single" w:sz="4" w:space="0" w:color="DEE0E3"/>
+              <w:left w:val="single" w:sz="4" w:space="0" w:color="DEE0E3"/>
+              <w:bottom w:val="single" w:sz="4" w:space="0" w:color="DEE0E3"/>
+              <w:right w:val="single" w:sz="4" w:space="0" w:color="DEE0E3"/>
+            </w:tcBorders>
+            <w:noWrap/>
+            <w:vAlign w:val="center"/>
+            <w:hideMark/>
+          </w:tcPr>
+          <w:p>
+            <w:pPr>
+              <w:jc w:val="center"/>
+              <w:rPr>
+                <w:b/>
+                <w:bCs/>
+                <w:sz w:val="20"/>
+                <w:szCs w:val="20"/>
+              </w:rPr>
+            </w:pPr>
+            <w:r>
+              <w:rPr>
+                <w:b/>
+                <w:bCs/>
+                <w:sz w:val="20"/>
+                <w:szCs w:val="20"/>
+              </w:rPr>
+              <w:t>指标</w:t>
+            </w:r>
+          </w:p>
+        </w:tc>
+        <w:tc>
+          <w:tcPr>
+            <w:tcW w:w="0" w:type="auto"/>
+            <w:tcBorders>
+              <w:top w:val="single" w:sz="4" w:space="0" w:color="DEE0E3"/>
+              <w:left w:val="single" w:sz="4" w:space="0" w:color="DEE0E3"/>
+              <w:bottom w:val="single" w:sz="4" w:space="0" w:color="DEE0E3"/>
+              <w:right w:val="single" w:sz="4" w:space="0" w:color="DEE0E3"/>
+            </w:tcBorders>
+            <w:noWrap/>
+            <w:vAlign w:val="center"/>
+            <w:hideMark/>
+          </w:tcPr>
+          <w:p>
+            <w:pPr>
+              <w:jc w:val="center"/>
+              <w:rPr>
+                <w:b/>
+                <w:bCs/>
+                <w:sz w:val="20"/>
+                <w:szCs w:val="20"/>
+              </w:rPr>
+            </w:pPr>
+            <w:r>
+              <w:rPr>
+                <w:b/>
+                <w:bCs/>
+                <w:sz w:val="20"/>
+                <w:szCs w:val="20"/>
+              </w:rPr>
+              <w:t>定义</w:t>
+            </w:r>
+          </w:p>
+        </w:tc>
+        <w:tc>
+          <w:tcPr>
+            <w:tcW w:w="0" w:type="auto"/>
+            <w:tcBorders>
+              <w:top w:val="single" w:sz="4" w:space="0" w:color="DEE0E3"/>
+              <w:left w:val="single" w:sz="4" w:space="0" w:color="DEE0E3"/>
+              <w:bottom w:val="single" w:sz="4" w:space="0" w:color="DEE0E3"/>
+              <w:right w:val="single" w:sz="4" w:space="0" w:color="DEE0E3"/>
+            </w:tcBorders>
+            <w:noWrap/>
+            <w:vAlign w:val="center"/>
+            <w:hideMark/>
+          </w:tcPr>
+          <w:p>
+            <w:pPr>
+              <w:jc w:val="center"/>
+              <w:rPr>
+                <w:b/>
+                <w:bCs/>
+                <w:sz w:val="20"/>
+                <w:szCs w:val="20"/>
+              </w:rPr>
+            </w:pPr>
+            <w:r>
+              <w:rPr>
+                <w:b/>
+                <w:bCs/>
+                <w:sz w:val="20"/>
+                <w:szCs w:val="20"/>
+              </w:rPr>
+              <w:t>值得推全的信号</w:t>
+            </w:r>
+          </w:p>
+        </w:tc>
+        <w:tc>
+          <w:tcPr>
+            <w:tcW w:w="0" w:type="auto"/>
+            <w:tcBorders>
+              <w:top w:val="single" w:sz="4" w:space="0" w:color="DEE0E3"/>
+              <w:left w:val="single" w:sz="4" w:space="0" w:color="DEE0E3"/>
+              <w:bottom w:val="single" w:sz="4" w:space="0" w:color="DEE0E3"/>
+              <w:right w:val="single" w:sz="4" w:space="0" w:color="DEE0E3"/>
+            </w:tcBorders>
+            <w:noWrap/>
+            <w:vAlign w:val="center"/>
+            <w:hideMark/>
+          </w:tcPr>
+          <w:p>
+            <w:pPr>
+              <w:jc w:val="center"/>
+              <w:rPr>
+                <w:b/>
+                <w:bCs/>
+                <w:sz w:val="20"/>
+                <w:szCs w:val="20"/>
+              </w:rPr>
+            </w:pPr>
+            <w:r>
+              <w:rPr>
+                <w:b/>
+                <w:bCs/>
+                <w:sz w:val="20"/>
+                <w:szCs w:val="20"/>
+              </w:rPr>
+              <w:t>不建议推全的信号</w:t>
+            </w:r>
+          </w:p>
+        </w:tc>
+      </w:tr>
+      <w:tr>
+        <w:trPr>
+          <w:trHeight w:val="1545"/>
+        </w:trPr>
+        <w:tc>
+          <w:tcPr>
+            <w:tcW w:w="0" w:type="auto"/>
+            <w:tcBorders>
+              <w:top w:val="single" w:sz="4" w:space="0" w:color="DEE0E3"/>
+              <w:left w:val="single" w:sz="4" w:space="0" w:color="DEE0E3"/>
+              <w:bottom w:val="single" w:sz="4" w:space="0" w:color="DEE0E3"/>
+              <w:right w:val="single" w:sz="4" w:space="0" w:color="DEE0E3"/>
+            </w:tcBorders>
+            <w:noWrap/>
+            <w:vAlign w:val="center"/>
+            <w:hideMark/>
+          </w:tcPr>
+          <w:p>
+            <w:pPr>
+              <w:jc w:val="center"/>
+              <w:rPr>
+                <w:sz w:val="20"/>
+                <w:szCs w:val="20"/>
+              </w:rPr>
+            </w:pPr>
+            <w:r>
+              <w:rPr>
+                <w:sz w:val="20"/>
+                <w:szCs w:val="20"/>
+              </w:rPr>
+              <w:t>有效使用率</w:t>
+            </w:r>
+          </w:p>
+        </w:tc>
+        <w:tc>
+          <w:tcPr>
+            <w:tcW w:w="0" w:type="auto"/>
+            <w:tcBorders>
+              <w:top w:val="single" w:sz="4" w:space="0" w:color="DEE0E3"/>
+              <w:left w:val="single" w:sz="4" w:space="0" w:color="DEE0E3"/>
+              <w:bottom w:val="single" w:sz="4" w:space="0" w:color="DEE0E3"/>
+              <w:right w:val="single" w:sz="4" w:space="0" w:color="DEE0E3"/>
+            </w:tcBorders>
+            <w:noWrap/>
+            <w:vAlign w:val="center"/>
+            <w:hideMark/>
+          </w:tcPr>
+          <w:p>
+            <w:pPr>
+              <w:jc w:val="center"/>
+              <w:rPr>
+                <w:sz w:val="20"/>
+                <w:szCs w:val="20"/>
+              </w:rPr>
+            </w:pPr>
+            <w:r>
+              <w:rPr>
+                <w:sz w:val="20"/>
+                <w:szCs w:val="20"/>
+              </w:rPr>
+              <w:t>开通后，完成至少一次有效交互的用户占比。有效交互包括：查看对局前建议、接受</w:t>
+            </w:r>
+            <w:r>
+              <w:rPr>
+                <w:sz w:val="20"/>
+                <w:szCs w:val="20"/>
+              </w:rPr>
+              <w:t>/</w:t>
+            </w:r>
+            <w:r>
+              <w:rPr>
+                <w:sz w:val="20"/>
+                <w:szCs w:val="20"/>
+              </w:rPr>
+              <w:t>展开局内提示、查看赛后复盘、保存批注等；不能只算曝光。</w:t>
+            </w:r>
+          </w:p>
+        </w:tc>
+        <w:tc>
+          <w:tcPr>
+            <w:tcW w:w="0" w:type="auto"/>
+            <w:tcBorders>
+              <w:top w:val="single" w:sz="4" w:space="0" w:color="DEE0E3"/>
+              <w:left w:val="single" w:sz="4" w:space="0" w:color="DEE0E3"/>
+              <w:bottom w:val="single" w:sz="4" w:space="0" w:color="DEE0E3"/>
+              <w:right w:val="single" w:sz="4" w:space="0" w:color="DEE0E3"/>
+            </w:tcBorders>
+            <w:noWrap/>
+            <w:vAlign w:val="center"/>
+            <w:hideMark/>
+          </w:tcPr>
+          <w:p>
+            <w:pPr>
+              <w:jc w:val="center"/>
+              <w:rPr>
+                <w:sz w:val="20"/>
+                <w:szCs w:val="20"/>
+              </w:rPr>
+            </w:pPr>
+            <w:r>
+              <w:rPr>
+                <w:sz w:val="20"/>
+                <w:szCs w:val="20"/>
+              </w:rPr>
+              <w:t>总体</w:t>
+            </w:r>
+            <w:r>
+              <w:rPr>
+                <w:sz w:val="20"/>
+                <w:szCs w:val="20"/>
+              </w:rPr>
+              <w:t xml:space="preserve"> &gt;= 70%</w:t>
+            </w:r>
+            <w:r>
+              <w:rPr>
+                <w:sz w:val="20"/>
+                <w:szCs w:val="20"/>
+              </w:rPr>
+              <w:t>；新手</w:t>
+            </w:r>
+            <w:r>
+              <w:rPr>
+                <w:sz w:val="20"/>
+                <w:szCs w:val="20"/>
+              </w:rPr>
+              <w:t>/</w:t>
+            </w:r>
+            <w:r>
+              <w:rPr>
+                <w:sz w:val="20"/>
+                <w:szCs w:val="20"/>
+              </w:rPr>
+              <w:t>回流</w:t>
+            </w:r>
+            <w:r>
+              <w:rPr>
+                <w:sz w:val="20"/>
+                <w:szCs w:val="20"/>
+              </w:rPr>
+              <w:t xml:space="preserve"> &gt;= 80%</w:t>
+            </w:r>
+            <w:r>
+              <w:rPr>
+                <w:sz w:val="20"/>
+                <w:szCs w:val="20"/>
+              </w:rPr>
+              <w:t>；普通活跃</w:t>
+            </w:r>
+            <w:r>
+              <w:rPr>
+                <w:sz w:val="20"/>
+                <w:szCs w:val="20"/>
+              </w:rPr>
+              <w:t xml:space="preserve"> &gt;= 50%</w:t>
+            </w:r>
+            <w:r>
+              <w:rPr>
+                <w:sz w:val="20"/>
+                <w:szCs w:val="20"/>
+              </w:rPr>
+              <w:t>；高段位可较低，但主动查询或数据卡使用率应</w:t>
+            </w:r>
+            <w:r>
+              <w:rPr>
+                <w:sz w:val="20"/>
+                <w:szCs w:val="20"/>
+              </w:rPr>
+              <w:t xml:space="preserve"> &gt;= 20%</w:t>
+            </w:r>
+            <w:r>
+              <w:rPr>
+                <w:sz w:val="20"/>
+                <w:szCs w:val="20"/>
+              </w:rPr>
+              <w:t>。且第</w:t>
+            </w:r>
+            <w:r>
+              <w:rPr>
+                <w:sz w:val="20"/>
+                <w:szCs w:val="20"/>
+              </w:rPr>
+              <w:t xml:space="preserve"> 1 </w:t>
+            </w:r>
+            <w:r>
+              <w:rPr>
+                <w:sz w:val="20"/>
+                <w:szCs w:val="20"/>
+              </w:rPr>
+              <w:t>天到第</w:t>
+            </w:r>
+            <w:r>
+              <w:rPr>
+                <w:sz w:val="20"/>
+                <w:szCs w:val="20"/>
+              </w:rPr>
+              <w:t xml:space="preserve"> 7 </w:t>
+            </w:r>
+            <w:r>
+              <w:rPr>
+                <w:sz w:val="20"/>
+                <w:szCs w:val="20"/>
+              </w:rPr>
+              <w:t>天没有明显断崖。</w:t>
+            </w:r>
+          </w:p>
+        </w:tc>
+        <w:tc>
+          <w:tcPr>
+            <w:tcW w:w="0" w:type="auto"/>
+            <w:tcBorders>
+              <w:top w:val="single" w:sz="4" w:space="0" w:color="DEE0E3"/>
+              <w:left w:val="single" w:sz="4" w:space="0" w:color="DEE0E3"/>
+              <w:bottom w:val="single" w:sz="4" w:space="0" w:color="DEE0E3"/>
+              <w:right w:val="single" w:sz="4" w:space="0" w:color="DEE0E3"/>
+            </w:tcBorders>
+            <w:noWrap/>
+            <w:vAlign w:val="center"/>
+            <w:hideMark/>
+          </w:tcPr>
+          <w:p>
+            <w:pPr>
+              <w:jc w:val="center"/>
+              <w:rPr>
+                <w:sz w:val="20"/>
+                <w:szCs w:val="20"/>
+              </w:rPr>
+            </w:pPr>
+            <w:r>
+              <w:rPr>
+                <w:sz w:val="20"/>
+                <w:szCs w:val="20"/>
+              </w:rPr>
+              <w:t>只看曝光高、点击</w:t>
+            </w:r>
+            <w:r>
+              <w:rPr>
+                <w:sz w:val="20"/>
+                <w:szCs w:val="20"/>
+              </w:rPr>
+              <w:t>/</w:t>
+            </w:r>
+            <w:r>
+              <w:rPr>
+                <w:sz w:val="20"/>
+                <w:szCs w:val="20"/>
+              </w:rPr>
+              <w:t>展开低；或首日使用高、随后快速跌至</w:t>
+            </w:r>
+            <w:r>
+              <w:rPr>
+                <w:sz w:val="20"/>
+                <w:szCs w:val="20"/>
+              </w:rPr>
+              <w:t xml:space="preserve"> 10% </w:t>
+            </w:r>
+            <w:r>
+              <w:rPr>
+                <w:sz w:val="20"/>
+                <w:szCs w:val="20"/>
+              </w:rPr>
+              <w:t>以下，说明内容新鲜感大于真实价值。</w:t>
+            </w:r>
+          </w:p>
+        </w:tc>
+      </w:tr>
+      <w:tr>
+        <w:trPr>
+          <w:trHeight w:val="1830"/>
+        </w:trPr>
+        <w:tc>
+          <w:tcPr>
+            <w:tcW w:w="0" w:type="auto"/>
+            <w:tcBorders>
+              <w:top w:val="single" w:sz="4" w:space="0" w:color="DEE0E3"/>
+              <w:left w:val="single" w:sz="4" w:space="0" w:color="DEE0E3"/>
+              <w:bottom w:val="single" w:sz="4" w:space="0" w:color="DEE0E3"/>
+              <w:right w:val="single" w:sz="4" w:space="0" w:color="DEE0E3"/>
+            </w:tcBorders>
+            <w:noWrap/>
+            <w:vAlign w:val="center"/>
+            <w:hideMark/>
+          </w:tcPr>
+          <w:p>
+            <w:pPr>
+              <w:jc w:val="center"/>
+              <w:rPr>
+                <w:sz w:val="20"/>
+                <w:szCs w:val="20"/>
+              </w:rPr>
+            </w:pPr>
+            <w:r>
+              <w:rPr>
+                <w:sz w:val="20"/>
+                <w:szCs w:val="20"/>
+              </w:rPr>
+              <w:lastRenderedPageBreak/>
+              <w:t xml:space="preserve">7 </w:t>
+            </w:r>
+            <w:r>
+              <w:rPr>
+                <w:sz w:val="20"/>
+                <w:szCs w:val="20"/>
+              </w:rPr>
+              <w:t>日留存与复用率</w:t>
+            </w:r>
+          </w:p>
+        </w:tc>
+        <w:tc>
+          <w:tcPr>
+            <w:tcW w:w="0" w:type="auto"/>
+            <w:tcBorders>
+              <w:top w:val="single" w:sz="4" w:space="0" w:color="DEE0E3"/>
+              <w:left w:val="single" w:sz="4" w:space="0" w:color="DEE0E3"/>
+              <w:bottom w:val="single" w:sz="4" w:space="0" w:color="DEE0E3"/>
+              <w:right w:val="single" w:sz="4" w:space="0" w:color="DEE0E3"/>
+            </w:tcBorders>
+            <w:noWrap/>
+            <w:vAlign w:val="center"/>
+            <w:hideMark/>
+          </w:tcPr>
+          <w:p>
+            <w:pPr>
+              <w:jc w:val="center"/>
+              <w:rPr>
+                <w:sz w:val="20"/>
+                <w:szCs w:val="20"/>
+              </w:rPr>
+            </w:pPr>
+            <w:r>
+              <w:rPr>
+                <w:sz w:val="20"/>
+                <w:szCs w:val="20"/>
+              </w:rPr>
+              <w:t>首次使用后，用户在第</w:t>
+            </w:r>
+            <w:r>
+              <w:rPr>
+                <w:sz w:val="20"/>
+                <w:szCs w:val="20"/>
+              </w:rPr>
+              <w:t xml:space="preserve"> 2-7 </w:t>
+            </w:r>
+            <w:r>
+              <w:rPr>
+                <w:sz w:val="20"/>
+                <w:szCs w:val="20"/>
+              </w:rPr>
+              <w:t>天再次主动使用助手的比例；同时看每名用户每周覆盖的有效对局数。</w:t>
+            </w:r>
+          </w:p>
+        </w:tc>
+        <w:tc>
+          <w:tcPr>
+            <w:tcW w:w="0" w:type="auto"/>
+            <w:tcBorders>
+              <w:top w:val="single" w:sz="4" w:space="0" w:color="DEE0E3"/>
+              <w:left w:val="single" w:sz="4" w:space="0" w:color="DEE0E3"/>
+              <w:bottom w:val="single" w:sz="4" w:space="0" w:color="DEE0E3"/>
+              <w:right w:val="single" w:sz="4" w:space="0" w:color="DEE0E3"/>
+            </w:tcBorders>
+            <w:noWrap/>
+            <w:vAlign w:val="center"/>
+            <w:hideMark/>
+          </w:tcPr>
+          <w:p>
+            <w:pPr>
+              <w:jc w:val="center"/>
+              <w:rPr>
+                <w:sz w:val="20"/>
+                <w:szCs w:val="20"/>
+              </w:rPr>
+            </w:pPr>
+            <w:r>
+              <w:rPr>
+                <w:sz w:val="20"/>
+                <w:szCs w:val="20"/>
+              </w:rPr>
+              <w:t>助手</w:t>
+            </w:r>
+            <w:r>
+              <w:rPr>
+                <w:sz w:val="20"/>
+                <w:szCs w:val="20"/>
+              </w:rPr>
+              <w:t xml:space="preserve"> 7 </w:t>
+            </w:r>
+            <w:r>
+              <w:rPr>
+                <w:sz w:val="20"/>
+                <w:szCs w:val="20"/>
+              </w:rPr>
+              <w:t>日留存较对照组或历史同类功能高</w:t>
+            </w:r>
+            <w:r>
+              <w:rPr>
+                <w:sz w:val="20"/>
+                <w:szCs w:val="20"/>
+              </w:rPr>
+              <w:t xml:space="preserve"> &gt;= 3-5 </w:t>
+            </w:r>
+            <w:r>
+              <w:rPr>
+                <w:sz w:val="20"/>
+                <w:szCs w:val="20"/>
+              </w:rPr>
+              <w:t>个百分点；至少</w:t>
+            </w:r>
+            <w:r>
+              <w:rPr>
+                <w:sz w:val="20"/>
+                <w:szCs w:val="20"/>
+              </w:rPr>
+              <w:t xml:space="preserve"> 25% </w:t>
+            </w:r>
+            <w:r>
+              <w:rPr>
+                <w:sz w:val="20"/>
+                <w:szCs w:val="20"/>
+              </w:rPr>
+              <w:t>的已使用用户在不同日期或不同对局再次使用；复盘类、对局前类和局内类至少有一项稳定复用。</w:t>
+            </w:r>
+          </w:p>
+        </w:tc>
+        <w:tc>
+          <w:tcPr>
+            <w:tcW w:w="0" w:type="auto"/>
+            <w:tcBorders>
+              <w:top w:val="single" w:sz="4" w:space="0" w:color="DEE0E3"/>
+              <w:left w:val="single" w:sz="4" w:space="0" w:color="DEE0E3"/>
+              <w:bottom w:val="single" w:sz="4" w:space="0" w:color="DEE0E3"/>
+              <w:right w:val="single" w:sz="4" w:space="0" w:color="DEE0E3"/>
+            </w:tcBorders>
+            <w:noWrap/>
+            <w:vAlign w:val="center"/>
+            <w:hideMark/>
+          </w:tcPr>
+          <w:p>
+            <w:pPr>
+              <w:jc w:val="center"/>
+              <w:rPr>
+                <w:sz w:val="20"/>
+                <w:szCs w:val="20"/>
+              </w:rPr>
+            </w:pPr>
+            <w:r>
+              <w:rPr>
+                <w:sz w:val="20"/>
+                <w:szCs w:val="20"/>
+              </w:rPr>
+              <w:t>单局尝鲜后不再使用；用户只在输局后打开，且没有持续使用，说明产品可能被当作</w:t>
+            </w:r>
+            <w:r>
+              <w:rPr>
+                <w:sz w:val="20"/>
+                <w:szCs w:val="20"/>
+              </w:rPr>
+              <w:t>“</w:t>
+            </w:r>
+            <w:r>
+              <w:rPr>
+                <w:sz w:val="20"/>
+                <w:szCs w:val="20"/>
+              </w:rPr>
+              <w:t>输后找原因</w:t>
+            </w:r>
+            <w:r>
+              <w:rPr>
+                <w:sz w:val="20"/>
+                <w:szCs w:val="20"/>
+              </w:rPr>
+              <w:t>”</w:t>
+            </w:r>
+            <w:r>
+              <w:rPr>
+                <w:sz w:val="20"/>
+                <w:szCs w:val="20"/>
+              </w:rPr>
+              <w:t>的一次性工具。</w:t>
+            </w:r>
+          </w:p>
+        </w:tc>
+      </w:tr>
+      <w:tr>
+        <w:trPr>
+          <w:trHeight w:val="1545"/>
+        </w:trPr>
+        <w:tc>
+          <w:tcPr>
+            <w:tcW w:w="0" w:type="auto"/>
+            <w:tcBorders>
+              <w:top w:val="single" w:sz="4" w:space="0" w:color="DEE0E3"/>
+              <w:left w:val="single" w:sz="4" w:space="0" w:color="DEE0E3"/>
+              <w:bottom w:val="single" w:sz="4" w:space="0" w:color="DEE0E3"/>
+              <w:right w:val="single" w:sz="4" w:space="0" w:color="DEE0E3"/>
+            </w:tcBorders>
+            <w:noWrap/>
+            <w:vAlign w:val="center"/>
+            <w:hideMark/>
+          </w:tcPr>
+          <w:p>
+            <w:pPr>
+              <w:jc w:val="center"/>
+              <w:rPr>
+                <w:sz w:val="20"/>
+                <w:szCs w:val="20"/>
+              </w:rPr>
+            </w:pPr>
+            <w:r>
+              <w:rPr>
+                <w:sz w:val="20"/>
+                <w:szCs w:val="20"/>
+              </w:rPr>
+              <w:t>建议采纳率与执行转化率</w:t>
+            </w:r>
+          </w:p>
+        </w:tc>
+        <w:tc>
+          <w:tcPr>
+            <w:tcW w:w="0" w:type="auto"/>
+            <w:tcBorders>
+              <w:top w:val="single" w:sz="4" w:space="0" w:color="DEE0E3"/>
+              <w:left w:val="single" w:sz="4" w:space="0" w:color="DEE0E3"/>
+              <w:bottom w:val="single" w:sz="4" w:space="0" w:color="DEE0E3"/>
+              <w:right w:val="single" w:sz="4" w:space="0" w:color="DEE0E3"/>
+            </w:tcBorders>
+            <w:noWrap/>
+            <w:vAlign w:val="center"/>
+            <w:hideMark/>
+          </w:tcPr>
+          <w:p>
+            <w:pPr>
+              <w:jc w:val="center"/>
+              <w:rPr>
+                <w:sz w:val="20"/>
+                <w:szCs w:val="20"/>
+              </w:rPr>
+            </w:pPr>
+            <w:r>
+              <w:rPr>
+                <w:sz w:val="20"/>
+                <w:szCs w:val="20"/>
+              </w:rPr>
+              <w:t>不只看</w:t>
+            </w:r>
+            <w:r>
+              <w:rPr>
+                <w:sz w:val="20"/>
+                <w:szCs w:val="20"/>
+              </w:rPr>
+              <w:t>“</w:t>
+            </w:r>
+            <w:r>
+              <w:rPr>
+                <w:sz w:val="20"/>
+                <w:szCs w:val="20"/>
+              </w:rPr>
+              <w:t>用户看过</w:t>
+            </w:r>
+            <w:r>
+              <w:rPr>
+                <w:sz w:val="20"/>
+                <w:szCs w:val="20"/>
+              </w:rPr>
+              <w:t>”</w:t>
+            </w:r>
+            <w:r>
+              <w:rPr>
+                <w:sz w:val="20"/>
+                <w:szCs w:val="20"/>
+              </w:rPr>
+              <w:t>，还要看建议后是否发生对应行为。例如</w:t>
+            </w:r>
+            <w:r>
+              <w:rPr>
+                <w:sz w:val="20"/>
+                <w:szCs w:val="20"/>
+              </w:rPr>
+              <w:t>“</w:t>
+            </w:r>
+            <w:r>
+              <w:rPr>
+                <w:sz w:val="20"/>
+                <w:szCs w:val="20"/>
+              </w:rPr>
+              <w:t>先收线再接资源</w:t>
+            </w:r>
+            <w:r>
+              <w:rPr>
+                <w:sz w:val="20"/>
+                <w:szCs w:val="20"/>
+              </w:rPr>
+              <w:t>”</w:t>
+            </w:r>
+            <w:r>
+              <w:rPr>
+                <w:sz w:val="20"/>
+                <w:szCs w:val="20"/>
+              </w:rPr>
+              <w:t>后是否处理兵线，</w:t>
+            </w:r>
+            <w:r>
+              <w:rPr>
+                <w:sz w:val="20"/>
+                <w:szCs w:val="20"/>
+              </w:rPr>
+              <w:t>“</w:t>
+            </w:r>
+            <w:r>
+              <w:rPr>
+                <w:sz w:val="20"/>
+                <w:szCs w:val="20"/>
+              </w:rPr>
+              <w:t>无视野不接</w:t>
+            </w:r>
+            <w:r>
+              <w:rPr>
+                <w:sz w:val="20"/>
+                <w:szCs w:val="20"/>
+              </w:rPr>
+              <w:t>”</w:t>
+            </w:r>
+            <w:r>
+              <w:rPr>
+                <w:sz w:val="20"/>
+                <w:szCs w:val="20"/>
+              </w:rPr>
+              <w:t>后是否降低盲区深入。</w:t>
+            </w:r>
+          </w:p>
+        </w:tc>
+        <w:tc>
+          <w:tcPr>
+            <w:tcW w:w="0" w:type="auto"/>
+            <w:tcBorders>
+              <w:top w:val="single" w:sz="4" w:space="0" w:color="DEE0E3"/>
+              <w:left w:val="single" w:sz="4" w:space="0" w:color="DEE0E3"/>
+              <w:bottom w:val="single" w:sz="4" w:space="0" w:color="DEE0E3"/>
+              <w:right w:val="single" w:sz="4" w:space="0" w:color="DEE0E3"/>
+            </w:tcBorders>
+            <w:noWrap/>
+            <w:vAlign w:val="center"/>
+            <w:hideMark/>
+          </w:tcPr>
+          <w:p>
+            <w:pPr>
+              <w:jc w:val="center"/>
+              <w:rPr>
+                <w:sz w:val="20"/>
+                <w:szCs w:val="20"/>
+              </w:rPr>
+            </w:pPr>
+            <w:r>
+              <w:rPr>
+                <w:sz w:val="20"/>
+                <w:szCs w:val="20"/>
+              </w:rPr>
+              <w:t>高置信度、低打扰建议的采纳率</w:t>
+            </w:r>
+            <w:r>
+              <w:rPr>
+                <w:sz w:val="20"/>
+                <w:szCs w:val="20"/>
+              </w:rPr>
+              <w:t xml:space="preserve"> &gt;= 40-50%</w:t>
+            </w:r>
+            <w:r>
+              <w:rPr>
+                <w:sz w:val="20"/>
+                <w:szCs w:val="20"/>
+              </w:rPr>
+              <w:t>；被采纳后，目标行为相较同类未提示样本有</w:t>
+            </w:r>
+            <w:r>
+              <w:rPr>
+                <w:sz w:val="20"/>
+                <w:szCs w:val="20"/>
+              </w:rPr>
+              <w:t xml:space="preserve"> &gt;= 10% </w:t>
+            </w:r>
+            <w:r>
+              <w:rPr>
+                <w:sz w:val="20"/>
+                <w:szCs w:val="20"/>
+              </w:rPr>
+              <w:t>改善。</w:t>
+            </w:r>
+          </w:p>
+        </w:tc>
+        <w:tc>
+          <w:tcPr>
+            <w:tcW w:w="0" w:type="auto"/>
+            <w:tcBorders>
+              <w:top w:val="single" w:sz="4" w:space="0" w:color="DEE0E3"/>
+              <w:left w:val="single" w:sz="4" w:space="0" w:color="DEE0E3"/>
+              <w:bottom w:val="single" w:sz="4" w:space="0" w:color="DEE0E3"/>
+              <w:right w:val="single" w:sz="4" w:space="0" w:color="DEE0E3"/>
+            </w:tcBorders>
+            <w:noWrap/>
+            <w:vAlign w:val="center"/>
+            <w:hideMark/>
+          </w:tcPr>
+          <w:p>
+            <w:pPr>
+              <w:jc w:val="center"/>
+              <w:rPr>
+                <w:sz w:val="20"/>
+                <w:szCs w:val="20"/>
+              </w:rPr>
+            </w:pPr>
+            <w:r>
+              <w:rPr>
+                <w:sz w:val="20"/>
+                <w:szCs w:val="20"/>
+              </w:rPr>
+              <w:t>曝光高但采纳率低于</w:t>
+            </w:r>
+            <w:r>
+              <w:rPr>
+                <w:sz w:val="20"/>
+                <w:szCs w:val="20"/>
+              </w:rPr>
+              <w:t xml:space="preserve"> 10%</w:t>
+            </w:r>
+            <w:r>
+              <w:rPr>
+                <w:sz w:val="20"/>
+                <w:szCs w:val="20"/>
+              </w:rPr>
+              <w:t>；或采纳后结果无改善甚至变差。此时优先检查触发条件、上下文准确性和建议复杂度。</w:t>
+            </w:r>
+          </w:p>
+        </w:tc>
+      </w:tr>
+      <w:tr>
+        <w:trPr>
+          <w:trHeight w:val="1260"/>
+        </w:trPr>
+        <w:tc>
+          <w:tcPr>
+            <w:tcW w:w="0" w:type="auto"/>
+            <w:tcBorders>
+              <w:top w:val="single" w:sz="4" w:space="0" w:color="DEE0E3"/>
+              <w:left w:val="single" w:sz="4" w:space="0" w:color="DEE0E3"/>
+              <w:bottom w:val="single" w:sz="4" w:space="0" w:color="DEE0E3"/>
+              <w:right w:val="single" w:sz="4" w:space="0" w:color="DEE0E3"/>
+            </w:tcBorders>
+            <w:noWrap/>
+            <w:vAlign w:val="center"/>
+            <w:hideMark/>
+          </w:tcPr>
+          <w:p>
+            <w:pPr>
+              <w:jc w:val="center"/>
+              <w:rPr>
+                <w:sz w:val="20"/>
+                <w:szCs w:val="20"/>
+              </w:rPr>
+            </w:pPr>
+            <w:r>
+              <w:rPr>
+                <w:sz w:val="20"/>
+                <w:szCs w:val="20"/>
+              </w:rPr>
+              <w:t>核心行为改善率</w:t>
+            </w:r>
+          </w:p>
+        </w:tc>
+        <w:tc>
+          <w:tcPr>
+            <w:tcW w:w="0" w:type="auto"/>
+            <w:tcBorders>
+              <w:top w:val="single" w:sz="4" w:space="0" w:color="DEE0E3"/>
+              <w:left w:val="single" w:sz="4" w:space="0" w:color="DEE0E3"/>
+              <w:bottom w:val="single" w:sz="4" w:space="0" w:color="DEE0E3"/>
+              <w:right w:val="single" w:sz="4" w:space="0" w:color="DEE0E3"/>
+            </w:tcBorders>
+            <w:noWrap/>
+            <w:vAlign w:val="center"/>
+            <w:hideMark/>
+          </w:tcPr>
+          <w:p>
+            <w:pPr>
+              <w:jc w:val="center"/>
+              <w:rPr>
+                <w:sz w:val="20"/>
+                <w:szCs w:val="20"/>
+              </w:rPr>
+            </w:pPr>
+            <w:r>
+              <w:rPr>
+                <w:sz w:val="20"/>
+                <w:szCs w:val="20"/>
+              </w:rPr>
+              <w:t>根据人群定义不同的短期、可归因行为指标，而非直接看胜率。重点使用</w:t>
+            </w:r>
+            <w:r>
+              <w:rPr>
+                <w:sz w:val="20"/>
+                <w:szCs w:val="20"/>
+              </w:rPr>
+              <w:t>“</w:t>
+            </w:r>
+            <w:r>
+              <w:rPr>
+                <w:sz w:val="20"/>
+                <w:szCs w:val="20"/>
+              </w:rPr>
+              <w:t>同一用户上线前后</w:t>
+            </w:r>
+            <w:r>
+              <w:rPr>
+                <w:sz w:val="20"/>
+                <w:szCs w:val="20"/>
+              </w:rPr>
+              <w:t>”</w:t>
+            </w:r>
+            <w:r>
+              <w:rPr>
+                <w:sz w:val="20"/>
+                <w:szCs w:val="20"/>
+              </w:rPr>
+              <w:t>与</w:t>
+            </w:r>
+            <w:r>
+              <w:rPr>
+                <w:sz w:val="20"/>
+                <w:szCs w:val="20"/>
+              </w:rPr>
+              <w:t>“</w:t>
+            </w:r>
+            <w:r>
+              <w:rPr>
+                <w:sz w:val="20"/>
+                <w:szCs w:val="20"/>
+              </w:rPr>
+              <w:t>实验</w:t>
+            </w:r>
+            <w:r>
+              <w:rPr>
+                <w:sz w:val="20"/>
+                <w:szCs w:val="20"/>
+              </w:rPr>
+              <w:t>/</w:t>
+            </w:r>
+            <w:r>
+              <w:rPr>
+                <w:sz w:val="20"/>
+                <w:szCs w:val="20"/>
+              </w:rPr>
+              <w:t>对照差分</w:t>
+            </w:r>
+            <w:r>
+              <w:rPr>
+                <w:sz w:val="20"/>
+                <w:szCs w:val="20"/>
+              </w:rPr>
+              <w:t>”</w:t>
+            </w:r>
+            <w:r>
+              <w:rPr>
+                <w:sz w:val="20"/>
+                <w:szCs w:val="20"/>
+              </w:rPr>
+              <w:t>比较。</w:t>
+            </w:r>
+          </w:p>
+        </w:tc>
+        <w:tc>
+          <w:tcPr>
+            <w:tcW w:w="0" w:type="auto"/>
+            <w:tcBorders>
+              <w:top w:val="single" w:sz="4" w:space="0" w:color="DEE0E3"/>
+              <w:left w:val="single" w:sz="4" w:space="0" w:color="DEE0E3"/>
+              <w:bottom w:val="single" w:sz="4" w:space="0" w:color="DEE0E3"/>
+              <w:right w:val="single" w:sz="4" w:space="0" w:color="DEE0E3"/>
+            </w:tcBorders>
+            <w:noWrap/>
+            <w:vAlign w:val="center"/>
+            <w:hideMark/>
+          </w:tcPr>
+          <w:p>
+            <w:pPr>
+              <w:jc w:val="center"/>
+              <w:rPr>
+                <w:sz w:val="20"/>
+                <w:szCs w:val="20"/>
+              </w:rPr>
+            </w:pPr>
+            <w:r>
+              <w:rPr>
+                <w:sz w:val="20"/>
+                <w:szCs w:val="20"/>
+              </w:rPr>
+              <w:t>玩家胜率相较于使用助手前提高</w:t>
+            </w:r>
+            <w:r>
+              <w:rPr>
+                <w:sz w:val="20"/>
+                <w:szCs w:val="20"/>
+              </w:rPr>
+              <w:t>2%</w:t>
+            </w:r>
+            <w:r>
+              <w:rPr>
+                <w:sz w:val="20"/>
+                <w:szCs w:val="20"/>
+              </w:rPr>
+              <w:t>；</w:t>
+            </w:r>
+            <w:r>
+              <w:rPr>
+                <w:sz w:val="20"/>
+                <w:szCs w:val="20"/>
+              </w:rPr>
+              <w:t>KDA</w:t>
+            </w:r>
+            <w:r>
+              <w:rPr>
+                <w:sz w:val="20"/>
+                <w:szCs w:val="20"/>
+              </w:rPr>
+              <w:t>、参团率、补刀数、每分钟经济数等都有所提升</w:t>
+            </w:r>
+          </w:p>
+        </w:tc>
+        <w:tc>
+          <w:tcPr>
+            <w:tcW w:w="0" w:type="auto"/>
+            <w:tcBorders>
+              <w:top w:val="single" w:sz="4" w:space="0" w:color="DEE0E3"/>
+              <w:left w:val="single" w:sz="4" w:space="0" w:color="DEE0E3"/>
+              <w:bottom w:val="single" w:sz="4" w:space="0" w:color="DEE0E3"/>
+              <w:right w:val="single" w:sz="4" w:space="0" w:color="DEE0E3"/>
+            </w:tcBorders>
+            <w:noWrap/>
+            <w:vAlign w:val="center"/>
+            <w:hideMark/>
+          </w:tcPr>
+          <w:p>
+            <w:pPr>
+              <w:jc w:val="center"/>
+              <w:rPr>
+                <w:sz w:val="20"/>
+                <w:szCs w:val="20"/>
+              </w:rPr>
+            </w:pPr>
+            <w:r>
+              <w:rPr>
+                <w:sz w:val="20"/>
+                <w:szCs w:val="20"/>
+              </w:rPr>
+              <w:t>只提升点击和观看，没有任何行为变化；或某一类玩家被提示后死亡、挂机、投降、重复失误反而增加。</w:t>
+            </w:r>
+          </w:p>
+        </w:tc>
+      </w:tr>
+      <w:tr>
+        <w:trPr>
+          <w:trHeight w:val="1830"/>
+        </w:trPr>
+        <w:tc>
+          <w:tcPr>
+            <w:tcW w:w="0" w:type="auto"/>
+            <w:tcBorders>
+              <w:top w:val="single" w:sz="4" w:space="0" w:color="DEE0E3"/>
+              <w:left w:val="single" w:sz="4" w:space="0" w:color="DEE0E3"/>
+              <w:bottom w:val="single" w:sz="4" w:space="0" w:color="DEE0E3"/>
+              <w:right w:val="single" w:sz="4" w:space="0" w:color="DEE0E3"/>
+            </w:tcBorders>
+            <w:noWrap/>
+            <w:vAlign w:val="center"/>
+            <w:hideMark/>
+          </w:tcPr>
+          <w:p>
+            <w:pPr>
+              <w:jc w:val="center"/>
+              <w:rPr>
+                <w:sz w:val="20"/>
+                <w:szCs w:val="20"/>
+              </w:rPr>
+            </w:pPr>
+            <w:r>
+              <w:rPr>
+                <w:sz w:val="20"/>
+                <w:szCs w:val="20"/>
+              </w:rPr>
+              <w:t>对局体验与打扰率</w:t>
+            </w:r>
+          </w:p>
+        </w:tc>
+        <w:tc>
+          <w:tcPr>
+            <w:tcW w:w="0" w:type="auto"/>
+            <w:tcBorders>
+              <w:top w:val="single" w:sz="4" w:space="0" w:color="DEE0E3"/>
+              <w:left w:val="single" w:sz="4" w:space="0" w:color="DEE0E3"/>
+              <w:bottom w:val="single" w:sz="4" w:space="0" w:color="DEE0E3"/>
+              <w:right w:val="single" w:sz="4" w:space="0" w:color="DEE0E3"/>
+            </w:tcBorders>
+            <w:noWrap/>
+            <w:vAlign w:val="center"/>
+            <w:hideMark/>
+          </w:tcPr>
+          <w:p>
+            <w:pPr>
+              <w:jc w:val="center"/>
+              <w:rPr>
+                <w:sz w:val="20"/>
+                <w:szCs w:val="20"/>
+              </w:rPr>
+            </w:pPr>
+            <w:r>
+              <w:rPr>
+                <w:sz w:val="20"/>
+                <w:szCs w:val="20"/>
+              </w:rPr>
+              <w:t>衡量提示有没有在错误时机打断操作。包括关闭</w:t>
+            </w:r>
+            <w:r>
+              <w:rPr>
+                <w:sz w:val="20"/>
+                <w:szCs w:val="20"/>
+              </w:rPr>
+              <w:t>/</w:t>
+            </w:r>
+            <w:r>
+              <w:rPr>
+                <w:sz w:val="20"/>
+                <w:szCs w:val="20"/>
+              </w:rPr>
+              <w:t>屏蔽率、同类提示短时间重复触发率、提示后的操作中断、负反馈按钮、局内性能异常。</w:t>
+            </w:r>
+          </w:p>
+        </w:tc>
+        <w:tc>
+          <w:tcPr>
+            <w:tcW w:w="0" w:type="auto"/>
+            <w:tcBorders>
+              <w:top w:val="single" w:sz="4" w:space="0" w:color="DEE0E3"/>
+              <w:left w:val="single" w:sz="4" w:space="0" w:color="DEE0E3"/>
+              <w:bottom w:val="single" w:sz="4" w:space="0" w:color="DEE0E3"/>
+              <w:right w:val="single" w:sz="4" w:space="0" w:color="DEE0E3"/>
+            </w:tcBorders>
+            <w:noWrap/>
+            <w:vAlign w:val="center"/>
+            <w:hideMark/>
+          </w:tcPr>
+          <w:p>
+            <w:pPr>
+              <w:jc w:val="center"/>
+              <w:rPr>
+                <w:sz w:val="20"/>
+                <w:szCs w:val="20"/>
+              </w:rPr>
+            </w:pPr>
+            <w:r>
+              <w:rPr>
+                <w:sz w:val="20"/>
+                <w:szCs w:val="20"/>
+              </w:rPr>
+              <w:t>主动关闭</w:t>
+            </w:r>
+            <w:r>
+              <w:rPr>
+                <w:sz w:val="20"/>
+                <w:szCs w:val="20"/>
+              </w:rPr>
+              <w:t>/</w:t>
+            </w:r>
+            <w:r>
+              <w:rPr>
+                <w:sz w:val="20"/>
+                <w:szCs w:val="20"/>
+              </w:rPr>
+              <w:t>屏蔽率</w:t>
+            </w:r>
+            <w:r>
+              <w:rPr>
+                <w:sz w:val="20"/>
+                <w:szCs w:val="20"/>
+              </w:rPr>
+              <w:t xml:space="preserve"> &lt; 10%</w:t>
+            </w:r>
+            <w:r>
+              <w:rPr>
+                <w:sz w:val="20"/>
+                <w:szCs w:val="20"/>
+              </w:rPr>
+              <w:t>；</w:t>
+            </w:r>
+            <w:r>
+              <w:rPr>
+                <w:sz w:val="20"/>
+                <w:szCs w:val="20"/>
+              </w:rPr>
+              <w:t>“</w:t>
+            </w:r>
+            <w:r>
+              <w:rPr>
+                <w:sz w:val="20"/>
+                <w:szCs w:val="20"/>
+              </w:rPr>
+              <w:t>太频繁</w:t>
+            </w:r>
+            <w:r>
+              <w:rPr>
+                <w:sz w:val="20"/>
+                <w:szCs w:val="20"/>
+              </w:rPr>
+              <w:t>/</w:t>
+            </w:r>
+            <w:r>
+              <w:rPr>
+                <w:sz w:val="20"/>
+                <w:szCs w:val="20"/>
+              </w:rPr>
+              <w:t>不准</w:t>
+            </w:r>
+            <w:r>
+              <w:rPr>
+                <w:sz w:val="20"/>
+                <w:szCs w:val="20"/>
+              </w:rPr>
+              <w:t>/</w:t>
+            </w:r>
+            <w:r>
+              <w:rPr>
+                <w:sz w:val="20"/>
+                <w:szCs w:val="20"/>
+              </w:rPr>
+              <w:t>打扰操作</w:t>
+            </w:r>
+            <w:r>
+              <w:rPr>
+                <w:sz w:val="20"/>
+                <w:szCs w:val="20"/>
+              </w:rPr>
+              <w:t>”</w:t>
+            </w:r>
+            <w:r>
+              <w:rPr>
+                <w:sz w:val="20"/>
+                <w:szCs w:val="20"/>
+              </w:rPr>
+              <w:t>负反馈率</w:t>
+            </w:r>
+            <w:r>
+              <w:rPr>
+                <w:sz w:val="20"/>
+                <w:szCs w:val="20"/>
+              </w:rPr>
+              <w:t xml:space="preserve"> &lt; 5%</w:t>
+            </w:r>
+            <w:r>
+              <w:rPr>
+                <w:sz w:val="20"/>
+                <w:szCs w:val="20"/>
+              </w:rPr>
+              <w:t>；高强度团战、补刀、连招、逃生期间的违规提示率接近</w:t>
+            </w:r>
+            <w:r>
+              <w:rPr>
+                <w:sz w:val="20"/>
+                <w:szCs w:val="20"/>
+              </w:rPr>
+              <w:t xml:space="preserve"> 0</w:t>
+            </w:r>
+            <w:r>
+              <w:rPr>
+                <w:sz w:val="20"/>
+                <w:szCs w:val="20"/>
+              </w:rPr>
+              <w:t>；一局平均局内提示次数处于预设上限内，例如</w:t>
+            </w:r>
+            <w:r>
+              <w:rPr>
+                <w:sz w:val="20"/>
+                <w:szCs w:val="20"/>
+              </w:rPr>
+              <w:t xml:space="preserve"> &lt;= 3-5 </w:t>
+            </w:r>
+            <w:r>
+              <w:rPr>
+                <w:sz w:val="20"/>
+                <w:szCs w:val="20"/>
+              </w:rPr>
+              <w:t>次。</w:t>
+            </w:r>
+          </w:p>
+        </w:tc>
+        <w:tc>
+          <w:tcPr>
+            <w:tcW w:w="0" w:type="auto"/>
+            <w:tcBorders>
+              <w:top w:val="single" w:sz="4" w:space="0" w:color="DEE0E3"/>
+              <w:left w:val="single" w:sz="4" w:space="0" w:color="DEE0E3"/>
+              <w:bottom w:val="single" w:sz="4" w:space="0" w:color="DEE0E3"/>
+              <w:right w:val="single" w:sz="4" w:space="0" w:color="DEE0E3"/>
+            </w:tcBorders>
+            <w:noWrap/>
+            <w:vAlign w:val="center"/>
+            <w:hideMark/>
+          </w:tcPr>
+          <w:p>
+            <w:pPr>
+              <w:jc w:val="center"/>
+              <w:rPr>
+                <w:sz w:val="20"/>
+                <w:szCs w:val="20"/>
+              </w:rPr>
+            </w:pPr>
+            <w:r>
+              <w:rPr>
+                <w:sz w:val="20"/>
+                <w:szCs w:val="20"/>
+              </w:rPr>
+              <w:t>关闭率超过</w:t>
+            </w:r>
+            <w:r>
+              <w:rPr>
+                <w:sz w:val="20"/>
+                <w:szCs w:val="20"/>
+              </w:rPr>
+              <w:t xml:space="preserve"> 15%</w:t>
+            </w:r>
+            <w:r>
+              <w:rPr>
+                <w:sz w:val="20"/>
+                <w:szCs w:val="20"/>
+              </w:rPr>
+              <w:t>；高段位或活跃玩家集中投诉干扰；提示在团战、补刀、阵亡瞬间高频出现。即使其他指标好，也不应全量。</w:t>
+            </w:r>
+          </w:p>
+        </w:tc>
+      </w:tr>
+      <w:tr>
+        <w:trPr>
+          <w:trHeight w:val="1830"/>
+        </w:trPr>
+        <w:tc>
+          <w:tcPr>
+            <w:tcW w:w="0" w:type="auto"/>
+            <w:tcBorders>
+              <w:top w:val="single" w:sz="4" w:space="0" w:color="DEE0E3"/>
+              <w:left w:val="single" w:sz="4" w:space="0" w:color="DEE0E3"/>
+              <w:bottom w:val="single" w:sz="4" w:space="0" w:color="DEE0E3"/>
+              <w:right w:val="single" w:sz="4" w:space="0" w:color="DEE0E3"/>
+            </w:tcBorders>
+            <w:noWrap/>
+            <w:vAlign w:val="center"/>
+            <w:hideMark/>
+          </w:tcPr>
+          <w:p>
+            <w:pPr>
+              <w:jc w:val="center"/>
+              <w:rPr>
+                <w:sz w:val="20"/>
+                <w:szCs w:val="20"/>
+              </w:rPr>
+            </w:pPr>
+            <w:r>
+              <w:rPr>
+                <w:sz w:val="20"/>
+                <w:szCs w:val="20"/>
+              </w:rPr>
+              <w:t>内容准确性与可信度</w:t>
+            </w:r>
+          </w:p>
+        </w:tc>
+        <w:tc>
+          <w:tcPr>
+            <w:tcW w:w="0" w:type="auto"/>
+            <w:tcBorders>
+              <w:top w:val="single" w:sz="4" w:space="0" w:color="DEE0E3"/>
+              <w:left w:val="single" w:sz="4" w:space="0" w:color="DEE0E3"/>
+              <w:bottom w:val="single" w:sz="4" w:space="0" w:color="DEE0E3"/>
+              <w:right w:val="single" w:sz="4" w:space="0" w:color="DEE0E3"/>
+            </w:tcBorders>
+            <w:noWrap/>
+            <w:vAlign w:val="center"/>
+            <w:hideMark/>
+          </w:tcPr>
+          <w:p>
+            <w:pPr>
+              <w:jc w:val="center"/>
+              <w:rPr>
+                <w:sz w:val="20"/>
+                <w:szCs w:val="20"/>
+              </w:rPr>
+            </w:pPr>
+            <w:r>
+              <w:rPr>
+                <w:sz w:val="20"/>
+                <w:szCs w:val="20"/>
+              </w:rPr>
+              <w:t>评估提示是否基于合法公开信息、是否符合当前正式版本，以及建议与实际局势是否匹配。可由规则校验、人工抽检、用户反馈和复盘回放共同验证。</w:t>
+            </w:r>
+          </w:p>
+        </w:tc>
+        <w:tc>
+          <w:tcPr>
+            <w:tcW w:w="0" w:type="auto"/>
+            <w:tcBorders>
+              <w:top w:val="single" w:sz="4" w:space="0" w:color="DEE0E3"/>
+              <w:left w:val="single" w:sz="4" w:space="0" w:color="DEE0E3"/>
+              <w:bottom w:val="single" w:sz="4" w:space="0" w:color="DEE0E3"/>
+              <w:right w:val="single" w:sz="4" w:space="0" w:color="DEE0E3"/>
+            </w:tcBorders>
+            <w:noWrap/>
+            <w:vAlign w:val="center"/>
+            <w:hideMark/>
+          </w:tcPr>
+          <w:p>
+            <w:pPr>
+              <w:jc w:val="center"/>
+              <w:rPr>
+                <w:sz w:val="20"/>
+                <w:szCs w:val="20"/>
+              </w:rPr>
+            </w:pPr>
+            <w:r>
+              <w:rPr>
+                <w:sz w:val="20"/>
+                <w:szCs w:val="20"/>
+              </w:rPr>
+              <w:t>高影响建议准确率</w:t>
+            </w:r>
+            <w:r>
+              <w:rPr>
+                <w:sz w:val="20"/>
+                <w:szCs w:val="20"/>
+              </w:rPr>
+              <w:t xml:space="preserve"> &gt;= 95%</w:t>
+            </w:r>
+            <w:r>
+              <w:rPr>
+                <w:sz w:val="20"/>
+                <w:szCs w:val="20"/>
+              </w:rPr>
+              <w:t>；涉及版本、英雄、装备、资源计时的事实错误率</w:t>
+            </w:r>
+            <w:r>
+              <w:rPr>
+                <w:sz w:val="20"/>
+                <w:szCs w:val="20"/>
+              </w:rPr>
+              <w:t xml:space="preserve"> &lt; 1%</w:t>
+            </w:r>
+            <w:r>
+              <w:rPr>
+                <w:sz w:val="20"/>
+                <w:szCs w:val="20"/>
+              </w:rPr>
+              <w:t>；不应出现泄露不可见敌方位置、错误引用测试服信息、把概率判断说成事实等严重问题。</w:t>
+            </w:r>
+          </w:p>
+        </w:tc>
+        <w:tc>
+          <w:tcPr>
+            <w:tcW w:w="0" w:type="auto"/>
+            <w:tcBorders>
+              <w:top w:val="single" w:sz="4" w:space="0" w:color="DEE0E3"/>
+              <w:left w:val="single" w:sz="4" w:space="0" w:color="DEE0E3"/>
+              <w:bottom w:val="single" w:sz="4" w:space="0" w:color="DEE0E3"/>
+              <w:right w:val="single" w:sz="4" w:space="0" w:color="DEE0E3"/>
+            </w:tcBorders>
+            <w:noWrap/>
+            <w:vAlign w:val="center"/>
+            <w:hideMark/>
+          </w:tcPr>
+          <w:p>
+            <w:pPr>
+              <w:jc w:val="center"/>
+              <w:rPr>
+                <w:sz w:val="20"/>
+                <w:szCs w:val="20"/>
+              </w:rPr>
+            </w:pPr>
+            <w:r>
+              <w:rPr>
+                <w:sz w:val="20"/>
+                <w:szCs w:val="20"/>
+              </w:rPr>
+              <w:t>任何外挂式信息泄露、错误版本数据、错误英雄机制、明显误导性策略；此类问题不看比例，应立即阻断对应能力并修复。</w:t>
+            </w:r>
+          </w:p>
+        </w:tc>
+      </w:tr>
+      <w:tr>
+        <w:trPr>
+          <w:trHeight w:val="1830"/>
+        </w:trPr>
+        <w:tc>
+          <w:tcPr>
+            <w:tcW w:w="0" w:type="auto"/>
+            <w:tcBorders>
+              <w:top w:val="single" w:sz="4" w:space="0" w:color="DEE0E3"/>
+              <w:left w:val="single" w:sz="4" w:space="0" w:color="DEE0E3"/>
+              <w:bottom w:val="single" w:sz="4" w:space="0" w:color="DEE0E3"/>
+              <w:right w:val="single" w:sz="4" w:space="0" w:color="DEE0E3"/>
+            </w:tcBorders>
+            <w:noWrap/>
+            <w:vAlign w:val="center"/>
+            <w:hideMark/>
+          </w:tcPr>
+          <w:p>
+            <w:pPr>
+              <w:jc w:val="center"/>
+              <w:rPr>
+                <w:sz w:val="20"/>
+                <w:szCs w:val="20"/>
+              </w:rPr>
+            </w:pPr>
+            <w:r>
+              <w:rPr>
+                <w:sz w:val="20"/>
+                <w:szCs w:val="20"/>
+              </w:rPr>
+              <w:t>负向行为与公平性护栏</w:t>
+            </w:r>
+          </w:p>
+        </w:tc>
+        <w:tc>
+          <w:tcPr>
+            <w:tcW w:w="0" w:type="auto"/>
+            <w:tcBorders>
+              <w:top w:val="single" w:sz="4" w:space="0" w:color="DEE0E3"/>
+              <w:left w:val="single" w:sz="4" w:space="0" w:color="DEE0E3"/>
+              <w:bottom w:val="single" w:sz="4" w:space="0" w:color="DEE0E3"/>
+              <w:right w:val="single" w:sz="4" w:space="0" w:color="DEE0E3"/>
+            </w:tcBorders>
+            <w:noWrap/>
+            <w:vAlign w:val="center"/>
+            <w:hideMark/>
+          </w:tcPr>
+          <w:p>
+            <w:pPr>
+              <w:jc w:val="center"/>
+              <w:rPr>
+                <w:sz w:val="20"/>
+                <w:szCs w:val="20"/>
+              </w:rPr>
+            </w:pPr>
+            <w:r>
+              <w:rPr>
+                <w:sz w:val="20"/>
+                <w:szCs w:val="20"/>
+              </w:rPr>
+              <w:t>观察使用后是否增加消极游戏、辱骂、投降、挂机、举报，以及不同人群是否受到不成比例的负面影响。</w:t>
+            </w:r>
+          </w:p>
+        </w:tc>
+        <w:tc>
+          <w:tcPr>
+            <w:tcW w:w="0" w:type="auto"/>
+            <w:tcBorders>
+              <w:top w:val="single" w:sz="4" w:space="0" w:color="DEE0E3"/>
+              <w:left w:val="single" w:sz="4" w:space="0" w:color="DEE0E3"/>
+              <w:bottom w:val="single" w:sz="4" w:space="0" w:color="DEE0E3"/>
+              <w:right w:val="single" w:sz="4" w:space="0" w:color="DEE0E3"/>
+            </w:tcBorders>
+            <w:noWrap/>
+            <w:vAlign w:val="center"/>
+            <w:hideMark/>
+          </w:tcPr>
+          <w:p>
+            <w:pPr>
+              <w:jc w:val="center"/>
+              <w:rPr>
+                <w:sz w:val="20"/>
+                <w:szCs w:val="20"/>
+              </w:rPr>
+            </w:pPr>
+            <w:r>
+              <w:rPr>
+                <w:sz w:val="20"/>
+                <w:szCs w:val="20"/>
+              </w:rPr>
+              <w:t>实验组相较对照组：挂机</w:t>
+            </w:r>
+            <w:r>
+              <w:rPr>
+                <w:sz w:val="20"/>
+                <w:szCs w:val="20"/>
+              </w:rPr>
+              <w:t>/</w:t>
+            </w:r>
+            <w:r>
+              <w:rPr>
+                <w:sz w:val="20"/>
+                <w:szCs w:val="20"/>
+              </w:rPr>
+              <w:t>消极游戏</w:t>
+            </w:r>
+            <w:r>
+              <w:rPr>
+                <w:sz w:val="20"/>
+                <w:szCs w:val="20"/>
+              </w:rPr>
+              <w:t>/</w:t>
+            </w:r>
+            <w:r>
+              <w:rPr>
+                <w:sz w:val="20"/>
+                <w:szCs w:val="20"/>
+              </w:rPr>
+              <w:t>辱骂</w:t>
+            </w:r>
+            <w:r>
+              <w:rPr>
+                <w:sz w:val="20"/>
+                <w:szCs w:val="20"/>
+              </w:rPr>
+              <w:t>/</w:t>
+            </w:r>
+            <w:r>
+              <w:rPr>
+                <w:sz w:val="20"/>
+                <w:szCs w:val="20"/>
+              </w:rPr>
+              <w:t>异常投降率不增长，最好下降；新手、回流和低段位用户的负反馈不显著高于整体；没有因推荐导致英雄选择过度集中、匹配环境恶化。</w:t>
+            </w:r>
+          </w:p>
+        </w:tc>
+        <w:tc>
+          <w:tcPr>
+            <w:tcW w:w="0" w:type="auto"/>
+            <w:tcBorders>
+              <w:top w:val="single" w:sz="4" w:space="0" w:color="DEE0E3"/>
+              <w:left w:val="single" w:sz="4" w:space="0" w:color="DEE0E3"/>
+              <w:bottom w:val="single" w:sz="4" w:space="0" w:color="DEE0E3"/>
+              <w:right w:val="single" w:sz="4" w:space="0" w:color="DEE0E3"/>
+            </w:tcBorders>
+            <w:noWrap/>
+            <w:vAlign w:val="center"/>
+            <w:hideMark/>
+          </w:tcPr>
+          <w:p>
+            <w:pPr>
+              <w:jc w:val="center"/>
+              <w:rPr>
+                <w:sz w:val="20"/>
+                <w:szCs w:val="20"/>
+              </w:rPr>
+            </w:pPr>
+            <w:r>
+              <w:rPr>
+                <w:sz w:val="20"/>
+                <w:szCs w:val="20"/>
+              </w:rPr>
+              <w:t>任一严重负向指标出现统计显著上涨；新手被高频提示后更快流失；某些英雄</w:t>
+            </w:r>
+            <w:r>
+              <w:rPr>
+                <w:sz w:val="20"/>
+                <w:szCs w:val="20"/>
+              </w:rPr>
+              <w:t>/</w:t>
+            </w:r>
+            <w:r>
+              <w:rPr>
+                <w:sz w:val="20"/>
+                <w:szCs w:val="20"/>
+              </w:rPr>
+              <w:t>位置因推荐过度集中而影响正常对局生态。</w:t>
+            </w:r>
+          </w:p>
+        </w:tc>
+      </w:tr>
+    </w:tbl>
     <w:p>
       <w:pPr>
         <w:rPr>
           <w:rFonts w:hint="eastAsia"/>
         </w:rPr>
       </w:pPr>
+    </w:p>
+    <w:p/>
+    <w:p>
       <w:r>
         <w:rPr>
           <w:rFonts w:hint="eastAsia"/>

</xml_diff>